<commit_message>
docs: Adicionado teste unitário TU001.19
</commit_message>
<xml_diff>
--- a/documentacao/Especificacao_de_Requisitos_de_Software.docx
+++ b/documentacao/Especificacao_de_Requisitos_de_Software.docx
@@ -4160,15 +4160,7 @@
       </w:pPr>
       <w:r>
         <w:lastRenderedPageBreak/>
-        <w:t xml:space="preserve">Nesse primeiro momento o </w:t>
-      </w:r>
-      <w:proofErr w:type="spellStart"/>
-      <w:r>
-        <w:t>frontend</w:t>
-      </w:r>
-      <w:proofErr w:type="spellEnd"/>
-      <w:r>
-        <w:t xml:space="preserve"> do sistema não terá um aplicativo móvel, apenas a versão para navegadores.</w:t>
+        <w:t>Nesse primeiro momento o frontend do sistema não terá um aplicativo móvel, apenas a versão para navegadores.</w:t>
       </w:r>
       <w:r>
         <w:br w:type="page" w:clear="all"/>
@@ -4614,11 +4606,7 @@
       </w:pPr>
       <w:bookmarkStart w:id="23" w:name="_Toc191065895"/>
       <w:r>
-        <w:t xml:space="preserve">3.2.1 </w:t>
-      </w:r>
-      <w:proofErr w:type="spellStart"/>
-      <w:r>
-        <w:t>Back</w:t>
+        <w:t>3.2.1 Back</w:t>
       </w:r>
       <w:r>
         <w:t>-</w:t>
@@ -4627,7 +4615,6 @@
         <w:t>end</w:t>
       </w:r>
       <w:bookmarkEnd w:id="23"/>
-      <w:proofErr w:type="spellEnd"/>
     </w:p>
     <w:p/>
     <w:p>
@@ -4753,23 +4740,7 @@
         </w:numPr>
       </w:pPr>
       <w:r>
-        <w:t xml:space="preserve">Spring Web MVC: responsável por arquitetar as camadas de model e </w:t>
-      </w:r>
-      <w:proofErr w:type="spellStart"/>
-      <w:r>
-        <w:t>controller</w:t>
-      </w:r>
-      <w:proofErr w:type="spellEnd"/>
-      <w:r>
-        <w:t xml:space="preserve"> do projeto para criar as APIs </w:t>
-      </w:r>
-      <w:proofErr w:type="spellStart"/>
-      <w:r>
-        <w:t>Restful</w:t>
-      </w:r>
-      <w:proofErr w:type="spellEnd"/>
-      <w:r>
-        <w:t>.</w:t>
+        <w:t>Spring Web MVC: responsável por arquitetar as camadas de model e controller do projeto para criar as APIs Restful.</w:t>
       </w:r>
     </w:p>
     <w:p>
@@ -4781,15 +4752,7 @@
         </w:numPr>
       </w:pPr>
       <w:r>
-        <w:t xml:space="preserve">Spring </w:t>
-      </w:r>
-      <w:proofErr w:type="spellStart"/>
-      <w:r>
-        <w:t>Validation</w:t>
-      </w:r>
-      <w:proofErr w:type="spellEnd"/>
-      <w:r>
-        <w:t>: responsável por definir as validações dos dados.</w:t>
+        <w:t>Spring Validation: responsável por definir as validações dos dados.</w:t>
       </w:r>
     </w:p>
     <w:p>
@@ -4825,15 +4788,7 @@
         </w:numPr>
       </w:pPr>
       <w:r>
-        <w:t xml:space="preserve">Spring AMQP: responsável por fazer a comunicação assíncrona utilizando um broker de </w:t>
-      </w:r>
-      <w:proofErr w:type="spellStart"/>
-      <w:r>
-        <w:t>mensageiria</w:t>
-      </w:r>
-      <w:proofErr w:type="spellEnd"/>
-      <w:r>
-        <w:t xml:space="preserve"> entre os micros serviços.</w:t>
+        <w:t>Spring AMQP: responsável por fazer a comunicação assíncrona utilizando um broker de mensageiria entre os micros serviços.</w:t>
       </w:r>
     </w:p>
     <w:p>
@@ -4869,15 +4824,7 @@
         </w:numPr>
       </w:pPr>
       <w:r>
-        <w:t xml:space="preserve">Spring Cloud </w:t>
-      </w:r>
-      <w:proofErr w:type="spellStart"/>
-      <w:r>
-        <w:t>Config</w:t>
-      </w:r>
-      <w:proofErr w:type="spellEnd"/>
-      <w:r>
-        <w:t>: responsável por criar um servidor de configuração para os micros serviços.</w:t>
+        <w:t>Spring Cloud Config: responsável por criar um servidor de configuração para os micros serviços.</w:t>
       </w:r>
     </w:p>
     <w:p>
@@ -4889,23 +4836,7 @@
         </w:numPr>
       </w:pPr>
       <w:r>
-        <w:t xml:space="preserve">Spring Cloud Circuit </w:t>
-      </w:r>
-      <w:proofErr w:type="spellStart"/>
-      <w:r>
-        <w:t>Breaker</w:t>
-      </w:r>
-      <w:proofErr w:type="spellEnd"/>
-      <w:r>
-        <w:t xml:space="preserve"> Resilience4J: responsável por criar os métodos </w:t>
-      </w:r>
-      <w:proofErr w:type="spellStart"/>
-      <w:r>
-        <w:t>fallback</w:t>
-      </w:r>
-      <w:proofErr w:type="spellEnd"/>
-      <w:r>
-        <w:t xml:space="preserve"> para prevenir falhas.</w:t>
+        <w:t>Spring Cloud Circuit Breaker Resilience4J: responsável por criar os métodos fallback para prevenir falhas.</w:t>
       </w:r>
     </w:p>
     <w:p>
@@ -4991,15 +4922,7 @@
         <w:t>Descrição:</w:t>
       </w:r>
       <w:r>
-        <w:t xml:space="preserve">  A troca de mensagens entre os micros serviços devem ser feita utilizando o broker </w:t>
-      </w:r>
-      <w:proofErr w:type="spellStart"/>
-      <w:r>
-        <w:t>RabbiMQ</w:t>
-      </w:r>
-      <w:proofErr w:type="spellEnd"/>
-      <w:r>
-        <w:t>.</w:t>
+        <w:t xml:space="preserve">  A troca de mensagens entre os micros serviços devem ser feita utilizando o broker RabbiMQ.</w:t>
       </w:r>
     </w:p>
     <w:p/>
@@ -5017,16 +4940,8 @@
         <w:rPr>
           <w:color w:val="000000" w:themeColor="text1"/>
         </w:rPr>
-        <w:t xml:space="preserve">Log </w:t>
-      </w:r>
-      <w:proofErr w:type="spellStart"/>
-      <w:r>
-        <w:rPr>
-          <w:color w:val="000000" w:themeColor="text1"/>
-        </w:rPr>
-        <w:t>agregation</w:t>
-      </w:r>
-      <w:proofErr w:type="spellEnd"/>
+        <w:t>Log agregation</w:t>
+      </w:r>
     </w:p>
     <w:p/>
     <w:p>
@@ -5048,23 +4963,7 @@
         <w:t>Descrição:</w:t>
       </w:r>
       <w:r>
-        <w:t xml:space="preserve">  Os logs gerados pelos micros serviços devem ser centralizados utilizando o log </w:t>
-      </w:r>
-      <w:proofErr w:type="spellStart"/>
-      <w:r>
-        <w:t>agragation</w:t>
-      </w:r>
-      <w:proofErr w:type="spellEnd"/>
-      <w:r>
-        <w:t xml:space="preserve"> </w:t>
-      </w:r>
-      <w:proofErr w:type="spellStart"/>
-      <w:r>
-        <w:t>Elasticsearch</w:t>
-      </w:r>
-      <w:proofErr w:type="spellEnd"/>
-      <w:r>
-        <w:t>.</w:t>
+        <w:t xml:space="preserve">  Os logs gerados pelos micros serviços devem ser centralizados utilizando o log agragation Elasticsearch.</w:t>
       </w:r>
     </w:p>
     <w:p/>
@@ -5122,21 +5021,7 @@
         <w:rPr>
           <w:color w:val="FF0000"/>
         </w:rPr>
-        <w:t>Front-</w:t>
-      </w:r>
-      <w:proofErr w:type="spellStart"/>
-      <w:r>
-        <w:rPr>
-          <w:color w:val="FF0000"/>
-        </w:rPr>
-        <w:t>end</w:t>
-      </w:r>
-      <w:proofErr w:type="spellEnd"/>
-      <w:r>
-        <w:rPr>
-          <w:color w:val="FF0000"/>
-        </w:rPr>
-        <w:t xml:space="preserve"> </w:t>
+        <w:t xml:space="preserve">Front-end </w:t>
       </w:r>
     </w:p>
     <w:p/>
@@ -5727,15 +5612,7 @@
         <w:t>Descrição:</w:t>
       </w:r>
       <w:r>
-        <w:t xml:space="preserve"> O sistema deve ter status para o usuário, o status será usado para bloquear ou permitir o acesso ao sistema, eles devem obedecer </w:t>
-      </w:r>
-      <w:proofErr w:type="spellStart"/>
-      <w:r>
-        <w:t>as</w:t>
-      </w:r>
-      <w:proofErr w:type="spellEnd"/>
-      <w:r>
-        <w:t xml:space="preserve"> regras a seguir:</w:t>
+        <w:t xml:space="preserve"> O sistema deve ter status para o usuário, o status será usado para bloquear ou permitir o acesso ao sistema, eles devem obedecer as regras a seguir:</w:t>
       </w:r>
     </w:p>
     <w:p>
@@ -7001,23 +6878,7 @@
         <w:t>Usuário:</w:t>
       </w:r>
       <w:r>
-        <w:t xml:space="preserve"> Classe que representa os usuários que irão operar o sistema, é composta pelas classes </w:t>
-      </w:r>
-      <w:proofErr w:type="spellStart"/>
-      <w:r>
-        <w:t>UsuarioStatus</w:t>
-      </w:r>
-      <w:proofErr w:type="spellEnd"/>
-      <w:r>
-        <w:t xml:space="preserve"> e </w:t>
-      </w:r>
-      <w:proofErr w:type="spellStart"/>
-      <w:r>
-        <w:t>UsuarioTipo</w:t>
-      </w:r>
-      <w:proofErr w:type="spellEnd"/>
-      <w:r>
-        <w:t>, possui os atributos:</w:t>
+        <w:t xml:space="preserve"> Classe que representa os usuários que irão operar o sistema, é composta pelas classes UsuarioStatus e UsuarioTipo, possui os atributos:</w:t>
       </w:r>
     </w:p>
     <w:p>
@@ -7060,17 +6921,8 @@
                 <w:b/>
                 <w:bCs/>
               </w:rPr>
-              <w:t xml:space="preserve">Atributos da classe </w:t>
-            </w:r>
-            <w:proofErr w:type="spellStart"/>
-            <w:r>
-              <w:rPr>
-                <w:b/>
-                <w:bCs/>
-              </w:rPr>
-              <w:t>Usuario</w:t>
-            </w:r>
-            <w:proofErr w:type="spellEnd"/>
+              <w:t>Atributos da classe Usuario</w:t>
+            </w:r>
           </w:p>
         </w:tc>
       </w:tr>
@@ -7264,7 +7116,6 @@
                 <w:szCs w:val="22"/>
               </w:rPr>
             </w:pPr>
-            <w:proofErr w:type="spellStart"/>
             <w:r>
               <w:rPr>
                 <w:sz w:val="22"/>
@@ -7272,7 +7123,6 @@
               </w:rPr>
               <w:t>String</w:t>
             </w:r>
-            <w:proofErr w:type="spellEnd"/>
           </w:p>
         </w:tc>
       </w:tr>
@@ -7332,7 +7182,6 @@
                 <w:szCs w:val="22"/>
               </w:rPr>
             </w:pPr>
-            <w:proofErr w:type="spellStart"/>
             <w:r>
               <w:rPr>
                 <w:sz w:val="22"/>
@@ -7340,7 +7189,6 @@
               </w:rPr>
               <w:t>String</w:t>
             </w:r>
-            <w:proofErr w:type="spellEnd"/>
           </w:p>
         </w:tc>
       </w:tr>
@@ -7400,7 +7248,6 @@
                 <w:szCs w:val="22"/>
               </w:rPr>
             </w:pPr>
-            <w:proofErr w:type="spellStart"/>
             <w:r>
               <w:rPr>
                 <w:sz w:val="22"/>
@@ -7408,7 +7255,6 @@
               </w:rPr>
               <w:t>String</w:t>
             </w:r>
-            <w:proofErr w:type="spellEnd"/>
           </w:p>
         </w:tc>
       </w:tr>
@@ -7468,7 +7314,6 @@
                 <w:szCs w:val="22"/>
               </w:rPr>
             </w:pPr>
-            <w:proofErr w:type="spellStart"/>
             <w:r>
               <w:rPr>
                 <w:sz w:val="22"/>
@@ -7476,7 +7321,6 @@
               </w:rPr>
               <w:t>String</w:t>
             </w:r>
-            <w:proofErr w:type="spellEnd"/>
           </w:p>
         </w:tc>
       </w:tr>
@@ -7536,7 +7380,6 @@
                 <w:szCs w:val="22"/>
               </w:rPr>
             </w:pPr>
-            <w:proofErr w:type="spellStart"/>
             <w:r>
               <w:rPr>
                 <w:sz w:val="22"/>
@@ -7544,7 +7387,6 @@
               </w:rPr>
               <w:t>String</w:t>
             </w:r>
-            <w:proofErr w:type="spellEnd"/>
           </w:p>
         </w:tc>
       </w:tr>
@@ -7604,7 +7446,6 @@
                 <w:szCs w:val="22"/>
               </w:rPr>
             </w:pPr>
-            <w:proofErr w:type="spellStart"/>
             <w:r>
               <w:rPr>
                 <w:sz w:val="22"/>
@@ -7612,7 +7453,6 @@
               </w:rPr>
               <w:t>UsuarioStatus</w:t>
             </w:r>
-            <w:proofErr w:type="spellEnd"/>
           </w:p>
         </w:tc>
       </w:tr>
@@ -7675,7 +7515,6 @@
                 <w:szCs w:val="22"/>
               </w:rPr>
             </w:pPr>
-            <w:proofErr w:type="spellStart"/>
             <w:r>
               <w:rPr>
                 <w:sz w:val="22"/>
@@ -7683,7 +7522,6 @@
               </w:rPr>
               <w:t>UsuarioPerfil</w:t>
             </w:r>
-            <w:proofErr w:type="spellEnd"/>
           </w:p>
         </w:tc>
       </w:tr>
@@ -7712,15 +7550,7 @@
         <w:fldChar w:fldCharType="end"/>
       </w:r>
       <w:r>
-        <w:t xml:space="preserve">: atributos da classe </w:t>
-      </w:r>
-      <w:proofErr w:type="spellStart"/>
-      <w:r>
-        <w:t>Usuario</w:t>
-      </w:r>
-      <w:proofErr w:type="spellEnd"/>
-      <w:r>
-        <w:t xml:space="preserve"> </w:t>
+        <w:t xml:space="preserve">: atributos da classe Usuario </w:t>
       </w:r>
     </w:p>
     <w:p>
@@ -7731,32 +7561,15 @@
           <w:numId w:val="14"/>
         </w:numPr>
       </w:pPr>
-      <w:proofErr w:type="spellStart"/>
       <w:r>
         <w:rPr>
           <w:b/>
           <w:bCs/>
         </w:rPr>
-        <w:t>UsuarioStatus</w:t>
-      </w:r>
-      <w:proofErr w:type="spellEnd"/>
-      <w:r>
-        <w:rPr>
-          <w:b/>
-          <w:bCs/>
-        </w:rPr>
-        <w:t>:</w:t>
-      </w:r>
-      <w:r>
-        <w:t xml:space="preserve"> Classe do tipo ENUM que representa o status do usuário, compõe a classe </w:t>
-      </w:r>
-      <w:proofErr w:type="spellStart"/>
-      <w:r>
-        <w:t>Usuario</w:t>
-      </w:r>
-      <w:proofErr w:type="spellEnd"/>
-      <w:r>
-        <w:t xml:space="preserve">, possui os atributos: </w:t>
+        <w:t>UsuarioStatus:</w:t>
+      </w:r>
+      <w:r>
+        <w:t xml:space="preserve"> Classe do tipo ENUM que representa o status do usuário, compõe a classe Usuario, possui os atributos: </w:t>
       </w:r>
     </w:p>
     <w:p>
@@ -7795,17 +7608,8 @@
                 <w:b/>
                 <w:bCs/>
               </w:rPr>
-              <w:t xml:space="preserve">Atributos da classe </w:t>
-            </w:r>
-            <w:proofErr w:type="spellStart"/>
-            <w:r>
-              <w:rPr>
-                <w:b/>
-                <w:bCs/>
-              </w:rPr>
-              <w:t>UsuarioStatus</w:t>
-            </w:r>
-            <w:proofErr w:type="spellEnd"/>
+              <w:t>Atributos da classe UsuarioStatus</w:t>
+            </w:r>
           </w:p>
         </w:tc>
       </w:tr>
@@ -7987,15 +7791,7 @@
         <w:fldChar w:fldCharType="end"/>
       </w:r>
       <w:r>
-        <w:t xml:space="preserve">: atributos da classe </w:t>
-      </w:r>
-      <w:proofErr w:type="spellStart"/>
-      <w:r>
-        <w:t>UsuarioStatus</w:t>
-      </w:r>
-      <w:proofErr w:type="spellEnd"/>
-      <w:r>
-        <w:t xml:space="preserve"> </w:t>
+        <w:t xml:space="preserve">: atributos da classe UsuarioStatus </w:t>
       </w:r>
     </w:p>
     <w:p>
@@ -8006,32 +7802,15 @@
           <w:numId w:val="15"/>
         </w:numPr>
       </w:pPr>
-      <w:proofErr w:type="spellStart"/>
       <w:r>
         <w:rPr>
           <w:b/>
           <w:bCs/>
         </w:rPr>
-        <w:t>UsuarioPerfil</w:t>
-      </w:r>
-      <w:proofErr w:type="spellEnd"/>
-      <w:r>
-        <w:rPr>
-          <w:b/>
-          <w:bCs/>
-        </w:rPr>
-        <w:t>:</w:t>
-      </w:r>
-      <w:r>
-        <w:t xml:space="preserve"> Classe do tipo ENUM que representa o perfil de acesso do usuário, compõe a classe </w:t>
-      </w:r>
-      <w:proofErr w:type="spellStart"/>
-      <w:r>
-        <w:t>Usuario</w:t>
-      </w:r>
-      <w:proofErr w:type="spellEnd"/>
-      <w:r>
-        <w:t xml:space="preserve">, possui os atributos: </w:t>
+        <w:t>UsuarioPerfil:</w:t>
+      </w:r>
+      <w:r>
+        <w:t xml:space="preserve"> Classe do tipo ENUM que representa o perfil de acesso do usuário, compõe a classe Usuario, possui os atributos: </w:t>
       </w:r>
     </w:p>
     <w:p>
@@ -8070,17 +7849,8 @@
                 <w:b/>
                 <w:bCs/>
               </w:rPr>
-              <w:t xml:space="preserve">Atributos da classe </w:t>
-            </w:r>
-            <w:proofErr w:type="spellStart"/>
-            <w:r>
-              <w:rPr>
-                <w:b/>
-                <w:bCs/>
-              </w:rPr>
-              <w:t>UsuarioPerfil</w:t>
-            </w:r>
-            <w:proofErr w:type="spellEnd"/>
+              <w:t>Atributos da classe UsuarioPerfil</w:t>
+            </w:r>
           </w:p>
         </w:tc>
       </w:tr>
@@ -8306,15 +8076,7 @@
         <w:fldChar w:fldCharType="end"/>
       </w:r>
       <w:r>
-        <w:t xml:space="preserve">: atributos da classe </w:t>
-      </w:r>
-      <w:proofErr w:type="spellStart"/>
-      <w:r>
-        <w:t>UsuarioPerfil</w:t>
-      </w:r>
-      <w:proofErr w:type="spellEnd"/>
-      <w:r>
-        <w:t xml:space="preserve"> </w:t>
+        <w:t xml:space="preserve">: atributos da classe UsuarioPerfil </w:t>
       </w:r>
     </w:p>
     <w:p>
@@ -9571,63 +9333,7 @@
                 <w:b w:val="0"/>
                 <w:bCs/>
               </w:rPr>
-              <w:t xml:space="preserve">Um usuário pode cadastrar </w:t>
-            </w:r>
-            <w:r>
-              <w:rPr>
-                <w:b w:val="0"/>
-                <w:bCs/>
-              </w:rPr>
-              <w:t>vários</w:t>
-            </w:r>
-            <w:r>
-              <w:rPr>
-                <w:b w:val="0"/>
-                <w:bCs/>
-              </w:rPr>
-              <w:t xml:space="preserve"> </w:t>
-            </w:r>
-            <w:r>
-              <w:rPr>
-                <w:b w:val="0"/>
-                <w:bCs/>
-              </w:rPr>
-              <w:t>produtos</w:t>
-            </w:r>
-            <w:r>
-              <w:rPr>
-                <w:b w:val="0"/>
-                <w:bCs/>
-              </w:rPr>
-              <w:t xml:space="preserve"> e um </w:t>
-            </w:r>
-            <w:r>
-              <w:rPr>
-                <w:b w:val="0"/>
-                <w:bCs/>
-              </w:rPr>
-              <w:t>produto</w:t>
-            </w:r>
-            <w:r>
-              <w:rPr>
-                <w:b w:val="0"/>
-                <w:bCs/>
-              </w:rPr>
-              <w:t xml:space="preserve"> pode ser cadastrad</w:t>
-            </w:r>
-            <w:r>
-              <w:rPr>
-                <w:b w:val="0"/>
-                <w:bCs/>
-              </w:rPr>
-              <w:t>o</w:t>
-            </w:r>
-            <w:r>
-              <w:rPr>
-                <w:b w:val="0"/>
-                <w:bCs/>
-              </w:rPr>
-              <w:t xml:space="preserve"> por um usuário.</w:t>
+              <w:t>Um usuário pode cadastrar vários produtos e um produto pode ser cadastrado por um usuário.</w:t>
             </w:r>
           </w:p>
         </w:tc>
@@ -9719,63 +9425,7 @@
                 <w:b w:val="0"/>
                 <w:bCs/>
               </w:rPr>
-              <w:t xml:space="preserve">Um usuário pode </w:t>
-            </w:r>
-            <w:r>
-              <w:rPr>
-                <w:b w:val="0"/>
-                <w:bCs/>
-              </w:rPr>
-              <w:t>gerenciar</w:t>
-            </w:r>
-            <w:r>
-              <w:rPr>
-                <w:b w:val="0"/>
-                <w:bCs/>
-              </w:rPr>
-              <w:t xml:space="preserve"> </w:t>
-            </w:r>
-            <w:r>
-              <w:rPr>
-                <w:b w:val="0"/>
-                <w:bCs/>
-              </w:rPr>
-              <w:t>vários preços</w:t>
-            </w:r>
-            <w:r>
-              <w:rPr>
-                <w:b w:val="0"/>
-                <w:bCs/>
-              </w:rPr>
-              <w:t xml:space="preserve"> e um </w:t>
-            </w:r>
-            <w:r>
-              <w:rPr>
-                <w:b w:val="0"/>
-                <w:bCs/>
-              </w:rPr>
-              <w:t>preço</w:t>
-            </w:r>
-            <w:r>
-              <w:rPr>
-                <w:b w:val="0"/>
-                <w:bCs/>
-              </w:rPr>
-              <w:t xml:space="preserve"> pode ser </w:t>
-            </w:r>
-            <w:r>
-              <w:rPr>
-                <w:b w:val="0"/>
-                <w:bCs/>
-              </w:rPr>
-              <w:t>gerenciado</w:t>
-            </w:r>
-            <w:r>
-              <w:rPr>
-                <w:b w:val="0"/>
-                <w:bCs/>
-              </w:rPr>
-              <w:t xml:space="preserve"> por um usuário.</w:t>
+              <w:t>Um usuário pode gerenciar vários preços e um preço pode ser gerenciado por um usuário.</w:t>
             </w:r>
           </w:p>
         </w:tc>
@@ -9888,14 +9538,7 @@
                 <w:b w:val="0"/>
                 <w:bCs/>
               </w:rPr>
-              <w:t>estoque</w:t>
-            </w:r>
-            <w:r>
-              <w:rPr>
-                <w:b w:val="0"/>
-                <w:bCs/>
-              </w:rPr>
-              <w:t xml:space="preserve"> </w:t>
+              <w:t xml:space="preserve">estoque </w:t>
             </w:r>
             <w:r>
               <w:rPr>
@@ -9994,35 +9637,7 @@
                 <w:b w:val="0"/>
                 <w:bCs/>
               </w:rPr>
-              <w:t xml:space="preserve">Um usuário pode gerenciar vários </w:t>
-            </w:r>
-            <w:r>
-              <w:rPr>
-                <w:b w:val="0"/>
-                <w:bCs/>
-              </w:rPr>
-              <w:t>pedidos</w:t>
-            </w:r>
-            <w:r>
-              <w:rPr>
-                <w:b w:val="0"/>
-                <w:bCs/>
-              </w:rPr>
-              <w:t xml:space="preserve"> e um </w:t>
-            </w:r>
-            <w:r>
-              <w:rPr>
-                <w:b w:val="0"/>
-                <w:bCs/>
-              </w:rPr>
-              <w:t>pedido</w:t>
-            </w:r>
-            <w:r>
-              <w:rPr>
-                <w:b w:val="0"/>
-                <w:bCs/>
-              </w:rPr>
-              <w:t xml:space="preserve"> pode ser gerenciado por um usuário.</w:t>
+              <w:t>Um usuário pode gerenciar vários pedidos e um pedido pode ser gerenciado por um usuário.</w:t>
             </w:r>
           </w:p>
         </w:tc>
@@ -10114,35 +9729,7 @@
                 <w:b w:val="0"/>
                 <w:bCs/>
               </w:rPr>
-              <w:t xml:space="preserve">Um usuário pode gerenciar vários </w:t>
-            </w:r>
-            <w:r>
-              <w:rPr>
-                <w:b w:val="0"/>
-                <w:bCs/>
-              </w:rPr>
-              <w:t>financeiros</w:t>
-            </w:r>
-            <w:r>
-              <w:rPr>
-                <w:b w:val="0"/>
-                <w:bCs/>
-              </w:rPr>
-              <w:t xml:space="preserve"> e um </w:t>
-            </w:r>
-            <w:r>
-              <w:rPr>
-                <w:b w:val="0"/>
-                <w:bCs/>
-              </w:rPr>
-              <w:t>financeiro</w:t>
-            </w:r>
-            <w:r>
-              <w:rPr>
-                <w:b w:val="0"/>
-                <w:bCs/>
-              </w:rPr>
-              <w:t xml:space="preserve"> pode ser gerenciado por um usuário.</w:t>
+              <w:t>Um usuário pode gerenciar vários financeiros e um financeiro pode ser gerenciado por um usuário.</w:t>
             </w:r>
           </w:p>
         </w:tc>
@@ -10234,63 +9821,7 @@
                 <w:b w:val="0"/>
                 <w:bCs/>
               </w:rPr>
-              <w:t xml:space="preserve">Um usuário pode cadastrar </w:t>
-            </w:r>
-            <w:r>
-              <w:rPr>
-                <w:b w:val="0"/>
-                <w:bCs/>
-              </w:rPr>
-              <w:t>vários</w:t>
-            </w:r>
-            <w:r>
-              <w:rPr>
-                <w:b w:val="0"/>
-                <w:bCs/>
-              </w:rPr>
-              <w:t xml:space="preserve"> </w:t>
-            </w:r>
-            <w:r>
-              <w:rPr>
-                <w:b w:val="0"/>
-                <w:bCs/>
-              </w:rPr>
-              <w:t>fornecedores</w:t>
-            </w:r>
-            <w:r>
-              <w:rPr>
-                <w:b w:val="0"/>
-                <w:bCs/>
-              </w:rPr>
-              <w:t xml:space="preserve"> e um </w:t>
-            </w:r>
-            <w:r>
-              <w:rPr>
-                <w:b w:val="0"/>
-                <w:bCs/>
-              </w:rPr>
-              <w:t>fornecedor</w:t>
-            </w:r>
-            <w:r>
-              <w:rPr>
-                <w:b w:val="0"/>
-                <w:bCs/>
-              </w:rPr>
-              <w:t xml:space="preserve"> pode ser cadastrad</w:t>
-            </w:r>
-            <w:r>
-              <w:rPr>
-                <w:b w:val="0"/>
-                <w:bCs/>
-              </w:rPr>
-              <w:t>o</w:t>
-            </w:r>
-            <w:r>
-              <w:rPr>
-                <w:b w:val="0"/>
-                <w:bCs/>
-              </w:rPr>
-              <w:t xml:space="preserve"> por um usuário.</w:t>
+              <w:t>Um usuário pode cadastrar vários fornecedores e um fornecedor pode ser cadastrado por um usuário.</w:t>
             </w:r>
           </w:p>
         </w:tc>
@@ -10333,13 +9864,8 @@
       <w:bookmarkEnd w:id="46"/>
       <w:bookmarkEnd w:id="47"/>
       <w:r>
-        <w:t xml:space="preserve"> </w:t>
-      </w:r>
-      <w:proofErr w:type="spellStart"/>
-      <w:r>
-        <w:t>Back-end</w:t>
-      </w:r>
-      <w:proofErr w:type="spellEnd"/>
+        <w:t xml:space="preserve"> Back-end</w:t>
+      </w:r>
     </w:p>
     <w:p/>
     <w:p>
@@ -10665,20 +10191,7 @@
           <w:color w:val="000000" w:themeColor="text1"/>
         </w:rPr>
         <w:tab/>
-      </w:r>
-      <w:proofErr w:type="spellStart"/>
-      <w:r>
-        <w:rPr>
-          <w:color w:val="000000" w:themeColor="text1"/>
-        </w:rPr>
-        <w:t>password</w:t>
-      </w:r>
-      <w:proofErr w:type="spellEnd"/>
-      <w:r>
-        <w:rPr>
-          <w:color w:val="000000" w:themeColor="text1"/>
-        </w:rPr>
-        <w:t>: “teste”</w:t>
+        <w:t>password: “teste”</w:t>
       </w:r>
     </w:p>
     <w:p>
@@ -10718,20 +10231,7 @@
           <w:color w:val="000000" w:themeColor="text1"/>
         </w:rPr>
         <w:tab/>
-      </w:r>
-      <w:proofErr w:type="spellStart"/>
-      <w:r>
-        <w:rPr>
-          <w:color w:val="000000" w:themeColor="text1"/>
-        </w:rPr>
-        <w:t>email</w:t>
-      </w:r>
-      <w:proofErr w:type="spellEnd"/>
-      <w:r>
-        <w:rPr>
-          <w:color w:val="000000" w:themeColor="text1"/>
-        </w:rPr>
-        <w:t>: “teste@email.com”</w:t>
+        <w:t>email: “teste@email.com”</w:t>
       </w:r>
     </w:p>
     <w:p>
@@ -10805,21 +10305,7 @@
         <w:rPr>
           <w:color w:val="000000" w:themeColor="text1"/>
         </w:rPr>
-        <w:t xml:space="preserve">Objeto </w:t>
-      </w:r>
-      <w:proofErr w:type="spellStart"/>
-      <w:r>
-        <w:rPr>
-          <w:color w:val="000000" w:themeColor="text1"/>
-        </w:rPr>
-        <w:t>Usuario</w:t>
-      </w:r>
-      <w:proofErr w:type="spellEnd"/>
-      <w:r>
-        <w:rPr>
-          <w:color w:val="000000" w:themeColor="text1"/>
-        </w:rPr>
-        <w:t xml:space="preserve"> não nulo.</w:t>
+        <w:t>Objeto Usuario não nulo.</w:t>
       </w:r>
     </w:p>
     <w:p>
@@ -11114,16 +10600,8 @@
           <w:color w:val="000000" w:themeColor="text1"/>
         </w:rPr>
         <w:tab/>
-        <w:t xml:space="preserve">nome: </w:t>
-      </w:r>
-      <w:proofErr w:type="spellStart"/>
-      <w:r>
-        <w:rPr>
-          <w:color w:val="000000" w:themeColor="text1"/>
-        </w:rPr>
-        <w:t>null</w:t>
-      </w:r>
-      <w:proofErr w:type="spellEnd"/>
+        <w:t>nome: null</w:t>
+      </w:r>
     </w:p>
     <w:p>
       <w:pPr>
@@ -11142,16 +10620,8 @@
           <w:color w:val="000000" w:themeColor="text1"/>
         </w:rPr>
         <w:tab/>
-        <w:t xml:space="preserve">login: </w:t>
-      </w:r>
-      <w:proofErr w:type="spellStart"/>
-      <w:r>
-        <w:rPr>
-          <w:color w:val="000000" w:themeColor="text1"/>
-        </w:rPr>
-        <w:t>null</w:t>
-      </w:r>
-      <w:proofErr w:type="spellEnd"/>
+        <w:t>login: null</w:t>
+      </w:r>
     </w:p>
     <w:p>
       <w:pPr>
@@ -11200,22 +10670,7 @@
           <w:lang w:val="en-US"/>
         </w:rPr>
         <w:tab/>
-      </w:r>
-      <w:proofErr w:type="spellStart"/>
-      <w:r>
-        <w:rPr>
-          <w:color w:val="000000" w:themeColor="text1"/>
-          <w:lang w:val="en-US"/>
-        </w:rPr>
-        <w:t>telefone</w:t>
-      </w:r>
-      <w:proofErr w:type="spellEnd"/>
-      <w:r>
-        <w:rPr>
-          <w:color w:val="000000" w:themeColor="text1"/>
-          <w:lang w:val="en-US"/>
-        </w:rPr>
-        <w:t>: null</w:t>
+        <w:t>telefone: null</w:t>
       </w:r>
     </w:p>
     <w:p>
@@ -11686,57 +11141,34 @@
           <w:lang w:val="en-US"/>
         </w:rPr>
         <w:tab/>
-      </w:r>
-      <w:proofErr w:type="spellStart"/>
+        <w:t>telefone: “11912345678”</w:t>
+      </w:r>
+    </w:p>
+    <w:p>
+      <w:pPr>
+        <w:rPr>
+          <w:color w:val="000000" w:themeColor="text1"/>
+        </w:rPr>
+      </w:pPr>
       <w:r>
         <w:rPr>
           <w:color w:val="000000" w:themeColor="text1"/>
           <w:lang w:val="en-US"/>
         </w:rPr>
-        <w:t>telefone</w:t>
-      </w:r>
-      <w:proofErr w:type="spellEnd"/>
+        <w:tab/>
+      </w:r>
       <w:r>
         <w:rPr>
           <w:color w:val="000000" w:themeColor="text1"/>
           <w:lang w:val="en-US"/>
         </w:rPr>
-        <w:t>: “11912345678”</w:t>
-      </w:r>
-    </w:p>
-    <w:p>
-      <w:pPr>
-        <w:rPr>
-          <w:color w:val="000000" w:themeColor="text1"/>
-        </w:rPr>
-      </w:pPr>
-      <w:r>
-        <w:rPr>
-          <w:color w:val="000000" w:themeColor="text1"/>
-          <w:lang w:val="en-US"/>
-        </w:rPr>
         <w:tab/>
       </w:r>
       <w:r>
         <w:rPr>
           <w:color w:val="000000" w:themeColor="text1"/>
-          <w:lang w:val="en-US"/>
-        </w:rPr>
-        <w:tab/>
-      </w:r>
-      <w:proofErr w:type="spellStart"/>
-      <w:r>
-        <w:rPr>
-          <w:color w:val="000000" w:themeColor="text1"/>
-        </w:rPr>
-        <w:t>email</w:t>
-      </w:r>
-      <w:proofErr w:type="spellEnd"/>
-      <w:r>
-        <w:rPr>
-          <w:color w:val="000000" w:themeColor="text1"/>
-        </w:rPr>
-        <w:t>: “teste@email.com”</w:t>
+        </w:rPr>
+        <w:t>email: “teste@email.com”</w:t>
       </w:r>
     </w:p>
     <w:p>
@@ -11810,21 +11242,7 @@
         <w:rPr>
           <w:color w:val="000000" w:themeColor="text1"/>
         </w:rPr>
-        <w:t xml:space="preserve">Lançar exceção </w:t>
-      </w:r>
-      <w:proofErr w:type="spellStart"/>
-      <w:r>
-        <w:rPr>
-          <w:color w:val="000000" w:themeColor="text1"/>
-        </w:rPr>
-        <w:t>InvalidNameException</w:t>
-      </w:r>
-      <w:proofErr w:type="spellEnd"/>
-      <w:r>
-        <w:rPr>
-          <w:color w:val="000000" w:themeColor="text1"/>
-        </w:rPr>
-        <w:t xml:space="preserve"> com a mensagem “O nome do usuário deve ter entre 4 e 32 caracteres”.</w:t>
+        <w:t>Lançar exceção InvalidNameException com a mensagem “O nome do usuário deve ter entre 4 e 32 caracteres”.</w:t>
       </w:r>
     </w:p>
     <w:p>
@@ -12112,91 +11530,7 @@
           <w:color w:val="000000" w:themeColor="text1"/>
         </w:rPr>
         <w:tab/>
-        <w:t>nome: “</w:t>
-      </w:r>
-      <w:proofErr w:type="spellStart"/>
-      <w:r>
-        <w:rPr>
-          <w:color w:val="000000" w:themeColor="text1"/>
-        </w:rPr>
-        <w:t>abcd</w:t>
-      </w:r>
-      <w:proofErr w:type="spellEnd"/>
-      <w:r>
-        <w:rPr>
-          <w:color w:val="000000" w:themeColor="text1"/>
-        </w:rPr>
-        <w:t xml:space="preserve"> </w:t>
-      </w:r>
-      <w:proofErr w:type="spellStart"/>
-      <w:r>
-        <w:rPr>
-          <w:color w:val="000000" w:themeColor="text1"/>
-        </w:rPr>
-        <w:t>efgh</w:t>
-      </w:r>
-      <w:proofErr w:type="spellEnd"/>
-      <w:r>
-        <w:rPr>
-          <w:color w:val="000000" w:themeColor="text1"/>
-        </w:rPr>
-        <w:t xml:space="preserve"> </w:t>
-      </w:r>
-      <w:proofErr w:type="spellStart"/>
-      <w:r>
-        <w:rPr>
-          <w:color w:val="000000" w:themeColor="text1"/>
-        </w:rPr>
-        <w:t>ijkl</w:t>
-      </w:r>
-      <w:proofErr w:type="spellEnd"/>
-      <w:r>
-        <w:rPr>
-          <w:color w:val="000000" w:themeColor="text1"/>
-        </w:rPr>
-        <w:t xml:space="preserve"> </w:t>
-      </w:r>
-      <w:proofErr w:type="spellStart"/>
-      <w:r>
-        <w:rPr>
-          <w:color w:val="000000" w:themeColor="text1"/>
-        </w:rPr>
-        <w:t>nmop</w:t>
-      </w:r>
-      <w:proofErr w:type="spellEnd"/>
-      <w:r>
-        <w:rPr>
-          <w:color w:val="000000" w:themeColor="text1"/>
-        </w:rPr>
-        <w:t xml:space="preserve"> </w:t>
-      </w:r>
-      <w:proofErr w:type="spellStart"/>
-      <w:r>
-        <w:rPr>
-          <w:color w:val="000000" w:themeColor="text1"/>
-        </w:rPr>
-        <w:t>qrst</w:t>
-      </w:r>
-      <w:proofErr w:type="spellEnd"/>
-      <w:r>
-        <w:rPr>
-          <w:color w:val="000000" w:themeColor="text1"/>
-        </w:rPr>
-        <w:t xml:space="preserve"> </w:t>
-      </w:r>
-      <w:proofErr w:type="spellStart"/>
-      <w:r>
-        <w:rPr>
-          <w:color w:val="000000" w:themeColor="text1"/>
-        </w:rPr>
-        <w:t>uvxz</w:t>
-      </w:r>
-      <w:proofErr w:type="spellEnd"/>
-      <w:r>
-        <w:rPr>
-          <w:color w:val="000000" w:themeColor="text1"/>
-        </w:rPr>
-        <w:t xml:space="preserve"> 123”</w:t>
+        <w:t>nome: “abcd efgh ijkl nmop qrst uvxz 123”</w:t>
       </w:r>
     </w:p>
     <w:p>
@@ -12269,57 +11603,34 @@
           <w:lang w:val="en-US"/>
         </w:rPr>
         <w:tab/>
-      </w:r>
-      <w:proofErr w:type="spellStart"/>
+        <w:t>telefone: “11912345678”</w:t>
+      </w:r>
+    </w:p>
+    <w:p>
+      <w:pPr>
+        <w:rPr>
+          <w:color w:val="000000" w:themeColor="text1"/>
+        </w:rPr>
+      </w:pPr>
       <w:r>
         <w:rPr>
           <w:color w:val="000000" w:themeColor="text1"/>
           <w:lang w:val="en-US"/>
         </w:rPr>
-        <w:t>telefone</w:t>
-      </w:r>
-      <w:proofErr w:type="spellEnd"/>
+        <w:tab/>
+      </w:r>
       <w:r>
         <w:rPr>
           <w:color w:val="000000" w:themeColor="text1"/>
           <w:lang w:val="en-US"/>
         </w:rPr>
-        <w:t>: “11912345678”</w:t>
-      </w:r>
-    </w:p>
-    <w:p>
-      <w:pPr>
-        <w:rPr>
-          <w:color w:val="000000" w:themeColor="text1"/>
-        </w:rPr>
-      </w:pPr>
-      <w:r>
-        <w:rPr>
-          <w:color w:val="000000" w:themeColor="text1"/>
-          <w:lang w:val="en-US"/>
-        </w:rPr>
         <w:tab/>
       </w:r>
       <w:r>
         <w:rPr>
           <w:color w:val="000000" w:themeColor="text1"/>
-          <w:lang w:val="en-US"/>
-        </w:rPr>
-        <w:tab/>
-      </w:r>
-      <w:proofErr w:type="spellStart"/>
-      <w:r>
-        <w:rPr>
-          <w:color w:val="000000" w:themeColor="text1"/>
-        </w:rPr>
-        <w:t>email</w:t>
-      </w:r>
-      <w:proofErr w:type="spellEnd"/>
-      <w:r>
-        <w:rPr>
-          <w:color w:val="000000" w:themeColor="text1"/>
-        </w:rPr>
-        <w:t>: “teste@email.com”</w:t>
+        </w:rPr>
+        <w:t>email: “teste@email.com”</w:t>
       </w:r>
     </w:p>
     <w:p>
@@ -12393,21 +11704,7 @@
         <w:rPr>
           <w:color w:val="000000" w:themeColor="text1"/>
         </w:rPr>
-        <w:t xml:space="preserve">Lançar exceção </w:t>
-      </w:r>
-      <w:proofErr w:type="spellStart"/>
-      <w:r>
-        <w:rPr>
-          <w:color w:val="000000" w:themeColor="text1"/>
-        </w:rPr>
-        <w:t>InvalidNameException</w:t>
-      </w:r>
-      <w:proofErr w:type="spellEnd"/>
-      <w:r>
-        <w:rPr>
-          <w:color w:val="000000" w:themeColor="text1"/>
-        </w:rPr>
-        <w:t xml:space="preserve"> com a mensagem “O nome do usuário deve ter entre 4 e 32 caracteres”.</w:t>
+        <w:t>Lançar exceção InvalidNameException com a mensagem “O nome do usuário deve ter entre 4 e 32 caracteres”.</w:t>
       </w:r>
     </w:p>
     <w:p>
@@ -12746,20 +12043,7 @@
           <w:color w:val="000000" w:themeColor="text1"/>
         </w:rPr>
         <w:tab/>
-      </w:r>
-      <w:proofErr w:type="spellStart"/>
-      <w:r>
-        <w:rPr>
-          <w:color w:val="000000" w:themeColor="text1"/>
-        </w:rPr>
-        <w:t>password</w:t>
-      </w:r>
-      <w:proofErr w:type="spellEnd"/>
-      <w:r>
-        <w:rPr>
-          <w:color w:val="000000" w:themeColor="text1"/>
-        </w:rPr>
-        <w:t>: “teste”</w:t>
+        <w:t>password: “teste”</w:t>
       </w:r>
     </w:p>
     <w:p>
@@ -12805,20 +12089,7 @@
           <w:color w:val="000000" w:themeColor="text1"/>
         </w:rPr>
         <w:tab/>
-      </w:r>
-      <w:proofErr w:type="spellStart"/>
-      <w:r>
-        <w:rPr>
-          <w:color w:val="000000" w:themeColor="text1"/>
-        </w:rPr>
-        <w:t>email</w:t>
-      </w:r>
-      <w:proofErr w:type="spellEnd"/>
-      <w:r>
-        <w:rPr>
-          <w:color w:val="000000" w:themeColor="text1"/>
-        </w:rPr>
-        <w:t>: “teste@email.com”</w:t>
+        <w:t>email: “teste@email.com”</w:t>
       </w:r>
     </w:p>
     <w:p>
@@ -12892,21 +12163,7 @@
         <w:rPr>
           <w:color w:val="000000" w:themeColor="text1"/>
         </w:rPr>
-        <w:t xml:space="preserve">Lançar exceção </w:t>
-      </w:r>
-      <w:proofErr w:type="spellStart"/>
-      <w:r>
-        <w:rPr>
-          <w:color w:val="000000" w:themeColor="text1"/>
-        </w:rPr>
-        <w:t>InvalidNameException</w:t>
-      </w:r>
-      <w:proofErr w:type="spellEnd"/>
-      <w:r>
-        <w:rPr>
-          <w:color w:val="000000" w:themeColor="text1"/>
-        </w:rPr>
-        <w:t xml:space="preserve"> com a mensagem “O nome do usuário não pode conter apenas espaços em branco”.</w:t>
+        <w:t>Lançar exceção InvalidNameException com a mensagem “O nome do usuário não pode conter apenas espaços em branco”.</w:t>
       </w:r>
     </w:p>
     <w:p>
@@ -13240,20 +12497,7 @@
           <w:color w:val="000000" w:themeColor="text1"/>
         </w:rPr>
         <w:tab/>
-      </w:r>
-      <w:proofErr w:type="spellStart"/>
-      <w:r>
-        <w:rPr>
-          <w:color w:val="000000" w:themeColor="text1"/>
-        </w:rPr>
-        <w:t>password</w:t>
-      </w:r>
-      <w:proofErr w:type="spellEnd"/>
-      <w:r>
-        <w:rPr>
-          <w:color w:val="000000" w:themeColor="text1"/>
-        </w:rPr>
-        <w:t>: “teste”</w:t>
+        <w:t>password: “teste”</w:t>
       </w:r>
     </w:p>
     <w:p>
@@ -13293,20 +12537,7 @@
           <w:color w:val="000000" w:themeColor="text1"/>
         </w:rPr>
         <w:tab/>
-      </w:r>
-      <w:proofErr w:type="spellStart"/>
-      <w:r>
-        <w:rPr>
-          <w:color w:val="000000" w:themeColor="text1"/>
-        </w:rPr>
-        <w:t>email</w:t>
-      </w:r>
-      <w:proofErr w:type="spellEnd"/>
-      <w:r>
-        <w:rPr>
-          <w:color w:val="000000" w:themeColor="text1"/>
-        </w:rPr>
-        <w:t>: “teste@email.com”</w:t>
+        <w:t>email: “teste@email.com”</w:t>
       </w:r>
     </w:p>
     <w:p>
@@ -13380,21 +12611,7 @@
         <w:rPr>
           <w:color w:val="000000" w:themeColor="text1"/>
         </w:rPr>
-        <w:t xml:space="preserve">Lançar exceção </w:t>
-      </w:r>
-      <w:proofErr w:type="spellStart"/>
-      <w:r>
-        <w:rPr>
-          <w:color w:val="000000" w:themeColor="text1"/>
-        </w:rPr>
-        <w:t>InvalidNameException</w:t>
-      </w:r>
-      <w:proofErr w:type="spellEnd"/>
-      <w:r>
-        <w:rPr>
-          <w:color w:val="000000" w:themeColor="text1"/>
-        </w:rPr>
-        <w:t xml:space="preserve"> com a mensagem “O nome do usuário não pode conter apenas números”.</w:t>
+        <w:t>Lançar exceção InvalidNameException com a mensagem “O nome do usuário não pode conter apenas números”.</w:t>
       </w:r>
     </w:p>
     <w:p>
@@ -13716,23 +12933,7 @@
           <w:color w:val="000000" w:themeColor="text1"/>
           <w:lang w:val="en-US"/>
         </w:rPr>
-        <w:t>login: “</w:t>
-      </w:r>
-      <w:proofErr w:type="spellStart"/>
-      <w:r>
-        <w:rPr>
-          <w:color w:val="000000" w:themeColor="text1"/>
-          <w:lang w:val="en-US"/>
-        </w:rPr>
-        <w:t>abc</w:t>
-      </w:r>
-      <w:proofErr w:type="spellEnd"/>
-      <w:r>
-        <w:rPr>
-          <w:color w:val="000000" w:themeColor="text1"/>
-          <w:lang w:val="en-US"/>
-        </w:rPr>
-        <w:t>”</w:t>
+        <w:t>login: “abc”</w:t>
       </w:r>
     </w:p>
     <w:p>
@@ -13778,22 +12979,7 @@
           <w:lang w:val="en-US"/>
         </w:rPr>
         <w:tab/>
-      </w:r>
-      <w:proofErr w:type="spellStart"/>
-      <w:r>
-        <w:rPr>
-          <w:color w:val="000000" w:themeColor="text1"/>
-          <w:lang w:val="en-US"/>
-        </w:rPr>
-        <w:t>telefone</w:t>
-      </w:r>
-      <w:proofErr w:type="spellEnd"/>
-      <w:r>
-        <w:rPr>
-          <w:color w:val="000000" w:themeColor="text1"/>
-          <w:lang w:val="en-US"/>
-        </w:rPr>
-        <w:t>: “11912345678”</w:t>
+        <w:t>telefone: “11912345678”</w:t>
       </w:r>
     </w:p>
     <w:p>
@@ -13897,21 +13083,7 @@
         <w:rPr>
           <w:color w:val="000000" w:themeColor="text1"/>
         </w:rPr>
-        <w:t xml:space="preserve">Lançar exceção </w:t>
-      </w:r>
-      <w:proofErr w:type="spellStart"/>
-      <w:r>
-        <w:rPr>
-          <w:color w:val="000000" w:themeColor="text1"/>
-        </w:rPr>
-        <w:t>InvalidLoginException</w:t>
-      </w:r>
-      <w:proofErr w:type="spellEnd"/>
-      <w:r>
-        <w:rPr>
-          <w:color w:val="000000" w:themeColor="text1"/>
-        </w:rPr>
-        <w:t xml:space="preserve"> com a mensagem “O login do usuário deve ter entre 4 e 32 caracteres”.</w:t>
+        <w:t>Lançar exceção InvalidLoginException com a mensagem “O login do usuário deve ter entre 4 e 32 caracteres”.</w:t>
       </w:r>
     </w:p>
     <w:p>
@@ -14245,20 +13417,7 @@
           <w:color w:val="000000" w:themeColor="text1"/>
         </w:rPr>
         <w:tab/>
-      </w:r>
-      <w:proofErr w:type="spellStart"/>
-      <w:r>
-        <w:rPr>
-          <w:color w:val="000000" w:themeColor="text1"/>
-        </w:rPr>
-        <w:t>password</w:t>
-      </w:r>
-      <w:proofErr w:type="spellEnd"/>
-      <w:r>
-        <w:rPr>
-          <w:color w:val="000000" w:themeColor="text1"/>
-        </w:rPr>
-        <w:t>: “teste”</w:t>
+        <w:t>password: “teste”</w:t>
       </w:r>
     </w:p>
     <w:p>
@@ -14298,20 +13457,7 @@
           <w:color w:val="000000" w:themeColor="text1"/>
         </w:rPr>
         <w:tab/>
-      </w:r>
-      <w:proofErr w:type="spellStart"/>
-      <w:r>
-        <w:rPr>
-          <w:color w:val="000000" w:themeColor="text1"/>
-        </w:rPr>
-        <w:t>email</w:t>
-      </w:r>
-      <w:proofErr w:type="spellEnd"/>
-      <w:r>
-        <w:rPr>
-          <w:color w:val="000000" w:themeColor="text1"/>
-        </w:rPr>
-        <w:t>: “teste@email.com”</w:t>
+        <w:t>email: “teste@email.com”</w:t>
       </w:r>
     </w:p>
     <w:p>
@@ -14385,21 +13531,7 @@
         <w:rPr>
           <w:color w:val="000000" w:themeColor="text1"/>
         </w:rPr>
-        <w:t xml:space="preserve">Lançar exceção </w:t>
-      </w:r>
-      <w:proofErr w:type="spellStart"/>
-      <w:r>
-        <w:rPr>
-          <w:color w:val="000000" w:themeColor="text1"/>
-        </w:rPr>
-        <w:t>InvalidLoginException</w:t>
-      </w:r>
-      <w:proofErr w:type="spellEnd"/>
-      <w:r>
-        <w:rPr>
-          <w:color w:val="000000" w:themeColor="text1"/>
-        </w:rPr>
-        <w:t xml:space="preserve"> com a mensagem “O nome do usuário deve ter entre 4 e 32 caracteres”.</w:t>
+        <w:t>Lançar exceção InvalidLoginException com a mensagem “O nome do usuário deve ter entre 4 e 32 caracteres”.</w:t>
       </w:r>
     </w:p>
     <w:p>
@@ -14791,20 +13923,7 @@
           <w:color w:val="000000" w:themeColor="text1"/>
         </w:rPr>
         <w:tab/>
-      </w:r>
-      <w:proofErr w:type="spellStart"/>
-      <w:r>
-        <w:rPr>
-          <w:color w:val="000000" w:themeColor="text1"/>
-        </w:rPr>
-        <w:t>email</w:t>
-      </w:r>
-      <w:proofErr w:type="spellEnd"/>
-      <w:r>
-        <w:rPr>
-          <w:color w:val="000000" w:themeColor="text1"/>
-        </w:rPr>
-        <w:t>: “teste@email.com”</w:t>
+        <w:t>email: “teste@email.com”</w:t>
       </w:r>
     </w:p>
     <w:p>
@@ -14878,21 +13997,7 @@
         <w:rPr>
           <w:color w:val="000000" w:themeColor="text1"/>
         </w:rPr>
-        <w:t xml:space="preserve">Lançar exceção </w:t>
-      </w:r>
-      <w:proofErr w:type="spellStart"/>
-      <w:r>
-        <w:rPr>
-          <w:color w:val="000000" w:themeColor="text1"/>
-        </w:rPr>
-        <w:t>InvalidLoginException</w:t>
-      </w:r>
-      <w:proofErr w:type="spellEnd"/>
-      <w:r>
-        <w:rPr>
-          <w:color w:val="000000" w:themeColor="text1"/>
-        </w:rPr>
-        <w:t xml:space="preserve"> com a mensagem “O login não deve conter espaços em branco”.</w:t>
+        <w:t>Lançar exceção InvalidLoginException com a mensagem “O login não deve conter espaços em branco”.</w:t>
       </w:r>
     </w:p>
     <w:p>
@@ -15261,21 +14366,12 @@
         </w:rPr>
         <w:tab/>
       </w:r>
-      <w:proofErr w:type="spellStart"/>
       <w:r>
         <w:rPr>
           <w:color w:val="000000" w:themeColor="text1"/>
           <w:lang w:val="en-US"/>
         </w:rPr>
-        <w:t>telefone</w:t>
-      </w:r>
-      <w:proofErr w:type="spellEnd"/>
-      <w:r>
-        <w:rPr>
-          <w:color w:val="000000" w:themeColor="text1"/>
-          <w:lang w:val="en-US"/>
-        </w:rPr>
-        <w:t>: “11912345678”</w:t>
+        <w:t>telefone: “11912345678”</w:t>
       </w:r>
     </w:p>
     <w:p>
@@ -15379,21 +14475,7 @@
         <w:rPr>
           <w:color w:val="000000" w:themeColor="text1"/>
         </w:rPr>
-        <w:t xml:space="preserve">Lançar exceção </w:t>
-      </w:r>
-      <w:proofErr w:type="spellStart"/>
-      <w:r>
-        <w:rPr>
-          <w:color w:val="000000" w:themeColor="text1"/>
-        </w:rPr>
-        <w:t>InvalidLoginException</w:t>
-      </w:r>
-      <w:proofErr w:type="spellEnd"/>
-      <w:r>
-        <w:rPr>
-          <w:color w:val="000000" w:themeColor="text1"/>
-        </w:rPr>
-        <w:t xml:space="preserve"> com a mensagem “O login não deve conter apenas números”.</w:t>
+        <w:t>Lançar exceção InvalidLoginException com a mensagem “O login não deve conter apenas números”.</w:t>
       </w:r>
     </w:p>
     <w:p>
@@ -15712,21 +14794,7 @@
         <w:rPr>
           <w:color w:val="000000" w:themeColor="text1"/>
         </w:rPr>
-        <w:t>login: “</w:t>
-      </w:r>
-      <w:proofErr w:type="spellStart"/>
-      <w:r>
-        <w:rPr>
-          <w:color w:val="000000" w:themeColor="text1"/>
-        </w:rPr>
-        <w:t>login.existente</w:t>
-      </w:r>
-      <w:proofErr w:type="spellEnd"/>
-      <w:r>
-        <w:rPr>
-          <w:color w:val="000000" w:themeColor="text1"/>
-        </w:rPr>
-        <w:t>”</w:t>
+        <w:t>login: “login.existente”</w:t>
       </w:r>
     </w:p>
     <w:p>
@@ -15746,20 +14814,7 @@
           <w:color w:val="000000" w:themeColor="text1"/>
         </w:rPr>
         <w:tab/>
-      </w:r>
-      <w:proofErr w:type="spellStart"/>
-      <w:r>
-        <w:rPr>
-          <w:color w:val="000000" w:themeColor="text1"/>
-        </w:rPr>
-        <w:t>password</w:t>
-      </w:r>
-      <w:proofErr w:type="spellEnd"/>
-      <w:r>
-        <w:rPr>
-          <w:color w:val="000000" w:themeColor="text1"/>
-        </w:rPr>
-        <w:t>: “teste”</w:t>
+        <w:t>password: “teste”</w:t>
       </w:r>
     </w:p>
     <w:p>
@@ -15799,20 +14854,7 @@
           <w:color w:val="000000" w:themeColor="text1"/>
         </w:rPr>
         <w:tab/>
-      </w:r>
-      <w:proofErr w:type="spellStart"/>
-      <w:r>
-        <w:rPr>
-          <w:color w:val="000000" w:themeColor="text1"/>
-        </w:rPr>
-        <w:t>email</w:t>
-      </w:r>
-      <w:proofErr w:type="spellEnd"/>
-      <w:r>
-        <w:rPr>
-          <w:color w:val="000000" w:themeColor="text1"/>
-        </w:rPr>
-        <w:t>: “teste@email.com”</w:t>
+        <w:t>email: “teste@email.com”</w:t>
       </w:r>
     </w:p>
     <w:p>
@@ -15891,21 +14933,7 @@
         <w:rPr>
           <w:color w:val="000000" w:themeColor="text1"/>
         </w:rPr>
-        <w:t xml:space="preserve">Lançar exceção </w:t>
-      </w:r>
-      <w:proofErr w:type="spellStart"/>
-      <w:r>
-        <w:rPr>
-          <w:color w:val="000000" w:themeColor="text1"/>
-        </w:rPr>
-        <w:t>InvalidLoginException</w:t>
-      </w:r>
-      <w:proofErr w:type="spellEnd"/>
-      <w:r>
-        <w:rPr>
-          <w:color w:val="000000" w:themeColor="text1"/>
-        </w:rPr>
-        <w:t xml:space="preserve"> com a mensagem “Login já cadastrado”.</w:t>
+        <w:t>Lançar exceção InvalidLoginException com a mensagem “Login já cadastrado”.</w:t>
       </w:r>
     </w:p>
     <w:p>
@@ -16220,21 +15248,7 @@
           <w:color w:val="000000" w:themeColor="text1"/>
         </w:rPr>
         <w:tab/>
-        <w:t>login: “</w:t>
-      </w:r>
-      <w:proofErr w:type="spellStart"/>
-      <w:r>
-        <w:rPr>
-          <w:color w:val="000000" w:themeColor="text1"/>
-        </w:rPr>
-        <w:t>login.alterado</w:t>
-      </w:r>
-      <w:proofErr w:type="spellEnd"/>
-      <w:r>
-        <w:rPr>
-          <w:color w:val="000000" w:themeColor="text1"/>
-        </w:rPr>
-        <w:t>”</w:t>
+        <w:t>login: “login.alterado”</w:t>
       </w:r>
     </w:p>
     <w:p>
@@ -16254,20 +15268,7 @@
           <w:color w:val="000000" w:themeColor="text1"/>
         </w:rPr>
         <w:tab/>
-      </w:r>
-      <w:proofErr w:type="spellStart"/>
-      <w:r>
-        <w:rPr>
-          <w:color w:val="000000" w:themeColor="text1"/>
-        </w:rPr>
-        <w:t>password</w:t>
-      </w:r>
-      <w:proofErr w:type="spellEnd"/>
-      <w:r>
-        <w:rPr>
-          <w:color w:val="000000" w:themeColor="text1"/>
-        </w:rPr>
-        <w:t>: “teste”</w:t>
+        <w:t>password: “teste”</w:t>
       </w:r>
     </w:p>
     <w:p>
@@ -16307,20 +15308,7 @@
           <w:color w:val="000000" w:themeColor="text1"/>
         </w:rPr>
         <w:tab/>
-      </w:r>
-      <w:proofErr w:type="spellStart"/>
-      <w:r>
-        <w:rPr>
-          <w:color w:val="000000" w:themeColor="text1"/>
-        </w:rPr>
-        <w:t>email</w:t>
-      </w:r>
-      <w:proofErr w:type="spellEnd"/>
-      <w:r>
-        <w:rPr>
-          <w:color w:val="000000" w:themeColor="text1"/>
-        </w:rPr>
-        <w:t>: “teste@email.com”</w:t>
+        <w:t>email: “teste@email.com”</w:t>
       </w:r>
     </w:p>
     <w:p>
@@ -16394,21 +15382,7 @@
         <w:rPr>
           <w:color w:val="000000" w:themeColor="text1"/>
         </w:rPr>
-        <w:t xml:space="preserve">Lançar exceção </w:t>
-      </w:r>
-      <w:proofErr w:type="spellStart"/>
-      <w:r>
-        <w:rPr>
-          <w:color w:val="000000" w:themeColor="text1"/>
-        </w:rPr>
-        <w:t>InvalidLoginException</w:t>
-      </w:r>
-      <w:proofErr w:type="spellEnd"/>
-      <w:r>
-        <w:rPr>
-          <w:color w:val="000000" w:themeColor="text1"/>
-        </w:rPr>
-        <w:t xml:space="preserve"> com a mensagem “Login não pode ser alterado”.</w:t>
+        <w:t>Lançar exceção InvalidLoginException com a mensagem “Login não pode ser alterado”.</w:t>
       </w:r>
     </w:p>
     <w:p>
@@ -16775,22 +15749,7 @@
           <w:lang w:val="en-US"/>
         </w:rPr>
         <w:tab/>
-      </w:r>
-      <w:proofErr w:type="spellStart"/>
-      <w:r>
-        <w:rPr>
-          <w:color w:val="000000" w:themeColor="text1"/>
-          <w:lang w:val="en-US"/>
-        </w:rPr>
-        <w:t>telefone</w:t>
-      </w:r>
-      <w:proofErr w:type="spellEnd"/>
-      <w:r>
-        <w:rPr>
-          <w:color w:val="000000" w:themeColor="text1"/>
-          <w:lang w:val="en-US"/>
-        </w:rPr>
-        <w:t>: “11912345678”</w:t>
+        <w:t>telefone: “11912345678”</w:t>
       </w:r>
     </w:p>
     <w:p>
@@ -16894,21 +15853,7 @@
         <w:rPr>
           <w:color w:val="000000" w:themeColor="text1"/>
         </w:rPr>
-        <w:t xml:space="preserve">Lançar exceção </w:t>
-      </w:r>
-      <w:proofErr w:type="spellStart"/>
-      <w:r>
-        <w:rPr>
-          <w:color w:val="000000" w:themeColor="text1"/>
-        </w:rPr>
-        <w:t>InvalidPasswordException</w:t>
-      </w:r>
-      <w:proofErr w:type="spellEnd"/>
-      <w:r>
-        <w:rPr>
-          <w:color w:val="000000" w:themeColor="text1"/>
-        </w:rPr>
-        <w:t xml:space="preserve"> com a mensagem “Senha do usuário deve ter entre 4 e 32 caracteres”.</w:t>
+        <w:t>Lançar exceção InvalidPasswordException com a mensagem “Senha do usuário deve ter entre 4 e 32 caracteres”.</w:t>
       </w:r>
     </w:p>
     <w:p>
@@ -17291,22 +16236,7 @@
           <w:lang w:val="en-US"/>
         </w:rPr>
         <w:tab/>
-      </w:r>
-      <w:proofErr w:type="spellStart"/>
-      <w:r>
-        <w:rPr>
-          <w:color w:val="000000" w:themeColor="text1"/>
-          <w:lang w:val="en-US"/>
-        </w:rPr>
-        <w:t>telefone</w:t>
-      </w:r>
-      <w:proofErr w:type="spellEnd"/>
-      <w:r>
-        <w:rPr>
-          <w:color w:val="000000" w:themeColor="text1"/>
-          <w:lang w:val="en-US"/>
-        </w:rPr>
-        <w:t>: “11912345678”</w:t>
+        <w:t>telefone: “11912345678”</w:t>
       </w:r>
     </w:p>
     <w:p>
@@ -17410,21 +16340,7 @@
         <w:rPr>
           <w:color w:val="000000" w:themeColor="text1"/>
         </w:rPr>
-        <w:t xml:space="preserve">Lançar exceção </w:t>
-      </w:r>
-      <w:proofErr w:type="spellStart"/>
-      <w:r>
-        <w:rPr>
-          <w:color w:val="000000" w:themeColor="text1"/>
-        </w:rPr>
-        <w:t>InvalidPasswordException</w:t>
-      </w:r>
-      <w:proofErr w:type="spellEnd"/>
-      <w:r>
-        <w:rPr>
-          <w:color w:val="000000" w:themeColor="text1"/>
-        </w:rPr>
-        <w:t xml:space="preserve"> com a mensagem “Senha do usuário deve ter entre 4 e 32 caracteres”.</w:t>
+        <w:t>Lançar exceção InvalidPasswordException com a mensagem “Senha do usuário deve ter entre 4 e 32 caracteres”.</w:t>
       </w:r>
     </w:p>
     <w:p>
@@ -17807,22 +16723,7 @@
           <w:lang w:val="en-US"/>
         </w:rPr>
         <w:tab/>
-      </w:r>
-      <w:proofErr w:type="spellStart"/>
-      <w:r>
-        <w:rPr>
-          <w:color w:val="000000" w:themeColor="text1"/>
-          <w:lang w:val="en-US"/>
-        </w:rPr>
-        <w:t>telefone</w:t>
-      </w:r>
-      <w:proofErr w:type="spellEnd"/>
-      <w:r>
-        <w:rPr>
-          <w:color w:val="000000" w:themeColor="text1"/>
-          <w:lang w:val="en-US"/>
-        </w:rPr>
-        <w:t>: “11912345678”</w:t>
+        <w:t>telefone: “11912345678”</w:t>
       </w:r>
     </w:p>
     <w:p>
@@ -17926,21 +16827,7 @@
         <w:rPr>
           <w:color w:val="000000" w:themeColor="text1"/>
         </w:rPr>
-        <w:t xml:space="preserve">Lançar exceção </w:t>
-      </w:r>
-      <w:proofErr w:type="spellStart"/>
-      <w:r>
-        <w:rPr>
-          <w:color w:val="000000" w:themeColor="text1"/>
-        </w:rPr>
-        <w:t>InvalidPasswordException</w:t>
-      </w:r>
-      <w:proofErr w:type="spellEnd"/>
-      <w:r>
-        <w:rPr>
-          <w:color w:val="000000" w:themeColor="text1"/>
-        </w:rPr>
-        <w:t xml:space="preserve"> com a mensagem “Senha do usuário não deve conter apenas espaços em branco”.</w:t>
+        <w:t>Lançar exceção InvalidPasswordException com a mensagem “Senha do usuário não deve conter apenas espaços em branco”.</w:t>
       </w:r>
     </w:p>
     <w:p>
@@ -18328,57 +17215,34 @@
           <w:lang w:val="en-US"/>
         </w:rPr>
         <w:tab/>
-      </w:r>
-      <w:proofErr w:type="spellStart"/>
+        <w:t>telefone: “1234”</w:t>
+      </w:r>
+    </w:p>
+    <w:p>
+      <w:pPr>
+        <w:rPr>
+          <w:color w:val="000000" w:themeColor="text1"/>
+        </w:rPr>
+      </w:pPr>
       <w:r>
         <w:rPr>
           <w:color w:val="000000" w:themeColor="text1"/>
           <w:lang w:val="en-US"/>
         </w:rPr>
-        <w:t>telefone</w:t>
-      </w:r>
-      <w:proofErr w:type="spellEnd"/>
+        <w:tab/>
+      </w:r>
       <w:r>
         <w:rPr>
           <w:color w:val="000000" w:themeColor="text1"/>
           <w:lang w:val="en-US"/>
         </w:rPr>
-        <w:t>: “1234”</w:t>
-      </w:r>
-    </w:p>
-    <w:p>
-      <w:pPr>
-        <w:rPr>
-          <w:color w:val="000000" w:themeColor="text1"/>
-        </w:rPr>
-      </w:pPr>
-      <w:r>
-        <w:rPr>
-          <w:color w:val="000000" w:themeColor="text1"/>
-          <w:lang w:val="en-US"/>
-        </w:rPr>
         <w:tab/>
       </w:r>
       <w:r>
         <w:rPr>
           <w:color w:val="000000" w:themeColor="text1"/>
-          <w:lang w:val="en-US"/>
-        </w:rPr>
-        <w:tab/>
-      </w:r>
-      <w:proofErr w:type="spellStart"/>
-      <w:r>
-        <w:rPr>
-          <w:color w:val="000000" w:themeColor="text1"/>
-        </w:rPr>
-        <w:t>email</w:t>
-      </w:r>
-      <w:proofErr w:type="spellEnd"/>
-      <w:r>
-        <w:rPr>
-          <w:color w:val="000000" w:themeColor="text1"/>
-        </w:rPr>
-        <w:t>: “teste@email.com”</w:t>
+        </w:rPr>
+        <w:t>email: “teste@email.com”</w:t>
       </w:r>
     </w:p>
     <w:p>
@@ -18452,21 +17316,7 @@
         <w:rPr>
           <w:color w:val="000000" w:themeColor="text1"/>
         </w:rPr>
-        <w:t xml:space="preserve">Lançar exceção </w:t>
-      </w:r>
-      <w:proofErr w:type="spellStart"/>
-      <w:r>
-        <w:rPr>
-          <w:color w:val="000000" w:themeColor="text1"/>
-        </w:rPr>
-        <w:t>InvalidPhoneException</w:t>
-      </w:r>
-      <w:proofErr w:type="spellEnd"/>
-      <w:r>
-        <w:rPr>
-          <w:color w:val="000000" w:themeColor="text1"/>
-        </w:rPr>
-        <w:t xml:space="preserve"> com a mensagem “Telefone inválido”.</w:t>
+        <w:t>Lançar exceção InvalidPhoneException com a mensagem “Telefone inválido”.</w:t>
       </w:r>
     </w:p>
     <w:p>
@@ -18816,23 +17666,7 @@
           <w:color w:val="000000" w:themeColor="text1"/>
           <w:lang w:val="en-US"/>
         </w:rPr>
-        <w:t>login: “</w:t>
-      </w:r>
-      <w:proofErr w:type="spellStart"/>
-      <w:r>
-        <w:rPr>
-          <w:color w:val="000000" w:themeColor="text1"/>
-          <w:lang w:val="en-US"/>
-        </w:rPr>
-        <w:t>login_existente</w:t>
-      </w:r>
-      <w:proofErr w:type="spellEnd"/>
-      <w:r>
-        <w:rPr>
-          <w:color w:val="000000" w:themeColor="text1"/>
-          <w:lang w:val="en-US"/>
-        </w:rPr>
-        <w:t>”</w:t>
+        <w:t>login: “login_existente”</w:t>
       </w:r>
     </w:p>
     <w:p>
@@ -18902,20 +17736,7 @@
           <w:color w:val="000000" w:themeColor="text1"/>
         </w:rPr>
         <w:tab/>
-      </w:r>
-      <w:proofErr w:type="spellStart"/>
-      <w:r>
-        <w:rPr>
-          <w:color w:val="000000" w:themeColor="text1"/>
-        </w:rPr>
-        <w:t>email</w:t>
-      </w:r>
-      <w:proofErr w:type="spellEnd"/>
-      <w:r>
-        <w:rPr>
-          <w:color w:val="000000" w:themeColor="text1"/>
-        </w:rPr>
-        <w:t>: “@email.com”</w:t>
+        <w:t>email: “@email.com”</w:t>
       </w:r>
     </w:p>
     <w:p>
@@ -18989,21 +17810,7 @@
         <w:rPr>
           <w:color w:val="000000" w:themeColor="text1"/>
         </w:rPr>
-        <w:t xml:space="preserve">Lançar exceção </w:t>
-      </w:r>
-      <w:proofErr w:type="spellStart"/>
-      <w:r>
-        <w:rPr>
-          <w:color w:val="000000" w:themeColor="text1"/>
-        </w:rPr>
-        <w:t>InvalidMailException</w:t>
-      </w:r>
-      <w:proofErr w:type="spellEnd"/>
-      <w:r>
-        <w:rPr>
-          <w:color w:val="000000" w:themeColor="text1"/>
-        </w:rPr>
-        <w:t xml:space="preserve"> com a mensagem “E-mail inválido”.</w:t>
+        <w:t>Lançar exceção InvalidMailException com a mensagem “E-mail inválido”.</w:t>
       </w:r>
     </w:p>
     <w:p>
@@ -19324,23 +18131,7 @@
           <w:color w:val="000000" w:themeColor="text1"/>
           <w:lang w:val="en-US"/>
         </w:rPr>
-        <w:t>login: “</w:t>
-      </w:r>
-      <w:proofErr w:type="spellStart"/>
-      <w:r>
-        <w:rPr>
-          <w:color w:val="000000" w:themeColor="text1"/>
-          <w:lang w:val="en-US"/>
-        </w:rPr>
-        <w:t>login_existente</w:t>
-      </w:r>
-      <w:proofErr w:type="spellEnd"/>
-      <w:r>
-        <w:rPr>
-          <w:color w:val="000000" w:themeColor="text1"/>
-          <w:lang w:val="en-US"/>
-        </w:rPr>
-        <w:t>”</w:t>
+        <w:t>login: “login_existente”</w:t>
       </w:r>
     </w:p>
     <w:p>
@@ -19410,20 +18201,7 @@
           <w:color w:val="000000" w:themeColor="text1"/>
         </w:rPr>
         <w:tab/>
-      </w:r>
-      <w:proofErr w:type="spellStart"/>
-      <w:r>
-        <w:rPr>
-          <w:color w:val="000000" w:themeColor="text1"/>
-        </w:rPr>
-        <w:t>email</w:t>
-      </w:r>
-      <w:proofErr w:type="spellEnd"/>
-      <w:r>
-        <w:rPr>
-          <w:color w:val="000000" w:themeColor="text1"/>
-        </w:rPr>
-        <w:t>: “teste@email.com”</w:t>
+        <w:t>email: “teste@email.com”</w:t>
       </w:r>
     </w:p>
     <w:p>
@@ -19501,21 +18279,607 @@
         <w:rPr>
           <w:color w:val="000000" w:themeColor="text1"/>
         </w:rPr>
-        <w:t xml:space="preserve">Lançar exceção </w:t>
-      </w:r>
-      <w:proofErr w:type="spellStart"/>
-      <w:r>
-        <w:rPr>
-          <w:color w:val="000000" w:themeColor="text1"/>
-        </w:rPr>
-        <w:t>InvalidStatusException</w:t>
-      </w:r>
-      <w:proofErr w:type="spellEnd"/>
-      <w:r>
-        <w:rPr>
-          <w:color w:val="000000" w:themeColor="text1"/>
-        </w:rPr>
-        <w:t xml:space="preserve"> com a mensagem “O status no cadastro do usuário deve ser ATIVO”.</w:t>
+        <w:t>Lançar exceção InvalidStatusException com a mensagem “O status no cadastro do usuário deve ser ATIVO”.</w:t>
+      </w:r>
+      <w:r>
+        <w:rPr>
+          <w:color w:val="000000" w:themeColor="text1"/>
+        </w:rPr>
+        <w:tab/>
+      </w:r>
+    </w:p>
+    <w:p>
+      <w:pPr>
+        <w:rPr>
+          <w:color w:val="000000" w:themeColor="text1"/>
+        </w:rPr>
+      </w:pPr>
+      <w:r>
+        <w:rPr>
+          <w:b/>
+          <w:color w:val="000000" w:themeColor="text1"/>
+        </w:rPr>
+        <w:t>Status:</w:t>
+      </w:r>
+      <w:r>
+        <w:rPr>
+          <w:color w:val="000000" w:themeColor="text1"/>
+        </w:rPr>
+        <w:t xml:space="preserve"> Não realizado.</w:t>
+      </w:r>
+    </w:p>
+    <w:p>
+      <w:pPr>
+        <w:rPr>
+          <w:color w:val="000000" w:themeColor="text1"/>
+        </w:rPr>
+      </w:pPr>
+      <w:r>
+        <w:rPr>
+          <w:b/>
+          <w:color w:val="000000" w:themeColor="text1"/>
+        </w:rPr>
+        <w:t>Realização do teste:</w:t>
+      </w:r>
+      <w:r>
+        <w:rPr>
+          <w:color w:val="000000" w:themeColor="text1"/>
+        </w:rPr>
+        <w:t xml:space="preserve"> 00/00/0000.</w:t>
+      </w:r>
+    </w:p>
+    <w:p>
+      <w:pPr>
+        <w:rPr>
+          <w:color w:val="000000" w:themeColor="text1"/>
+        </w:rPr>
+      </w:pPr>
+      <w:r>
+        <w:rPr>
+          <w:b/>
+          <w:color w:val="000000" w:themeColor="text1"/>
+        </w:rPr>
+        <w:t xml:space="preserve">Responsável: </w:t>
+      </w:r>
+      <w:r>
+        <w:rPr>
+          <w:color w:val="000000" w:themeColor="text1"/>
+        </w:rPr>
+        <w:t>A definir.</w:t>
+      </w:r>
+    </w:p>
+    <w:p>
+      <w:pPr>
+        <w:rPr>
+          <w:color w:val="000000" w:themeColor="text1"/>
+        </w:rPr>
+      </w:pPr>
+    </w:p>
+    <w:p>
+      <w:pPr>
+        <w:pStyle w:val="Ttulo4"/>
+        <w:rPr>
+          <w:color w:val="FF0000"/>
+        </w:rPr>
+      </w:pPr>
+      <w:r>
+        <w:t>6.1.1.18 [TU001.1</w:t>
+      </w:r>
+      <w:r>
+        <w:t>9</w:t>
+      </w:r>
+      <w:r>
+        <w:t xml:space="preserve">] </w:t>
+      </w:r>
+      <w:r>
+        <w:rPr>
+          <w:color w:val="000000" w:themeColor="text1"/>
+        </w:rPr>
+        <w:t xml:space="preserve">O sistema não deve cadastrar usuário quando o </w:t>
+      </w:r>
+      <w:r>
+        <w:rPr>
+          <w:color w:val="000000" w:themeColor="text1"/>
+        </w:rPr>
+        <w:t>perfil</w:t>
+      </w:r>
+      <w:r>
+        <w:rPr>
+          <w:color w:val="000000" w:themeColor="text1"/>
+        </w:rPr>
+        <w:t xml:space="preserve"> </w:t>
+      </w:r>
+      <w:r>
+        <w:rPr>
+          <w:color w:val="000000" w:themeColor="text1"/>
+        </w:rPr>
+        <w:t>não existe</w:t>
+      </w:r>
+    </w:p>
+    <w:p/>
+    <w:p>
+      <w:pPr>
+        <w:rPr>
+          <w:color w:val="000000" w:themeColor="text1"/>
+        </w:rPr>
+      </w:pPr>
+      <w:r>
+        <w:rPr>
+          <w:b/>
+          <w:bCs/>
+          <w:color w:val="000000" w:themeColor="text1"/>
+        </w:rPr>
+        <w:t>Camada:</w:t>
+      </w:r>
+      <w:r>
+        <w:rPr>
+          <w:color w:val="000000" w:themeColor="text1"/>
+        </w:rPr>
+        <w:t xml:space="preserve"> Serviço.</w:t>
+      </w:r>
+    </w:p>
+    <w:p>
+      <w:pPr>
+        <w:rPr>
+          <w:color w:val="000000" w:themeColor="text1"/>
+        </w:rPr>
+      </w:pPr>
+      <w:r>
+        <w:rPr>
+          <w:b/>
+          <w:color w:val="000000" w:themeColor="text1"/>
+        </w:rPr>
+        <w:t>Requisitos associados:</w:t>
+      </w:r>
+      <w:r>
+        <w:rPr>
+          <w:color w:val="000000" w:themeColor="text1"/>
+        </w:rPr>
+        <w:t xml:space="preserve"> RF001.01, RN001.1</w:t>
+      </w:r>
+      <w:r>
+        <w:rPr>
+          <w:color w:val="000000" w:themeColor="text1"/>
+        </w:rPr>
+        <w:t>5</w:t>
+      </w:r>
+      <w:r>
+        <w:rPr>
+          <w:color w:val="000000" w:themeColor="text1"/>
+        </w:rPr>
+        <w:t>.</w:t>
+      </w:r>
+    </w:p>
+    <w:p>
+      <w:pPr>
+        <w:rPr>
+          <w:color w:val="000000" w:themeColor="text1"/>
+        </w:rPr>
+      </w:pPr>
+      <w:r>
+        <w:rPr>
+          <w:b/>
+          <w:color w:val="000000" w:themeColor="text1"/>
+        </w:rPr>
+        <w:t xml:space="preserve">Descrição: </w:t>
+      </w:r>
+      <w:r>
+        <w:rPr>
+          <w:color w:val="000000" w:themeColor="text1"/>
+        </w:rPr>
+        <w:t>O sistema não deve cadastrar usuário.</w:t>
+      </w:r>
+    </w:p>
+    <w:p>
+      <w:pPr>
+        <w:rPr>
+          <w:color w:val="000000" w:themeColor="text1"/>
+        </w:rPr>
+      </w:pPr>
+      <w:r>
+        <w:rPr>
+          <w:b/>
+          <w:color w:val="000000" w:themeColor="text1"/>
+        </w:rPr>
+        <w:t>Condições</w:t>
+      </w:r>
+      <w:r>
+        <w:rPr>
+          <w:color w:val="000000" w:themeColor="text1"/>
+        </w:rPr>
+        <w:t xml:space="preserve">: </w:t>
+      </w:r>
+      <w:r>
+        <w:rPr>
+          <w:color w:val="000000" w:themeColor="text1"/>
+        </w:rPr>
+        <w:t>Perfil</w:t>
+      </w:r>
+      <w:r>
+        <w:rPr>
+          <w:color w:val="000000" w:themeColor="text1"/>
+        </w:rPr>
+        <w:t xml:space="preserve"> do usuário </w:t>
+      </w:r>
+      <w:r>
+        <w:rPr>
+          <w:color w:val="000000" w:themeColor="text1"/>
+        </w:rPr>
+        <w:t>não existe</w:t>
+      </w:r>
+      <w:r>
+        <w:rPr>
+          <w:color w:val="000000" w:themeColor="text1"/>
+        </w:rPr>
+        <w:t>.</w:t>
+      </w:r>
+    </w:p>
+    <w:p>
+      <w:pPr>
+        <w:rPr>
+          <w:color w:val="000000" w:themeColor="text1"/>
+        </w:rPr>
+      </w:pPr>
+      <w:r>
+        <w:rPr>
+          <w:b/>
+          <w:color w:val="000000" w:themeColor="text1"/>
+        </w:rPr>
+        <w:t>Passos:</w:t>
+      </w:r>
+      <w:r>
+        <w:rPr>
+          <w:color w:val="000000" w:themeColor="text1"/>
+        </w:rPr>
+        <w:t xml:space="preserve"> </w:t>
+      </w:r>
+    </w:p>
+    <w:p>
+      <w:pPr>
+        <w:pStyle w:val="PargrafodaLista"/>
+        <w:numPr>
+          <w:ilvl w:val="0"/>
+          <w:numId w:val="35"/>
+        </w:numPr>
+        <w:rPr>
+          <w:color w:val="000000" w:themeColor="text1"/>
+        </w:rPr>
+      </w:pPr>
+      <w:r>
+        <w:rPr>
+          <w:color w:val="000000" w:themeColor="text1"/>
+        </w:rPr>
+        <w:t xml:space="preserve">Informar os dados do usuário com </w:t>
+      </w:r>
+      <w:r>
+        <w:rPr>
+          <w:color w:val="000000" w:themeColor="text1"/>
+        </w:rPr>
+        <w:t>perfil que não existe</w:t>
+      </w:r>
+      <w:r>
+        <w:rPr>
+          <w:color w:val="000000" w:themeColor="text1"/>
+        </w:rPr>
+        <w:t>.</w:t>
+      </w:r>
+    </w:p>
+    <w:p>
+      <w:pPr>
+        <w:pStyle w:val="PargrafodaLista"/>
+        <w:numPr>
+          <w:ilvl w:val="0"/>
+          <w:numId w:val="35"/>
+        </w:numPr>
+        <w:rPr>
+          <w:color w:val="000000" w:themeColor="text1"/>
+        </w:rPr>
+      </w:pPr>
+      <w:r>
+        <w:rPr>
+          <w:color w:val="000000" w:themeColor="text1"/>
+        </w:rPr>
+        <w:t xml:space="preserve">Validar o </w:t>
+      </w:r>
+      <w:r>
+        <w:rPr>
+          <w:color w:val="000000" w:themeColor="text1"/>
+        </w:rPr>
+        <w:t>perfil</w:t>
+      </w:r>
+      <w:r>
+        <w:rPr>
+          <w:color w:val="000000" w:themeColor="text1"/>
+        </w:rPr>
+        <w:t>.</w:t>
+      </w:r>
+    </w:p>
+    <w:p>
+      <w:pPr>
+        <w:pStyle w:val="PargrafodaLista"/>
+        <w:numPr>
+          <w:ilvl w:val="0"/>
+          <w:numId w:val="35"/>
+        </w:numPr>
+        <w:rPr>
+          <w:color w:val="000000" w:themeColor="text1"/>
+        </w:rPr>
+      </w:pPr>
+      <w:r>
+        <w:rPr>
+          <w:color w:val="000000" w:themeColor="text1"/>
+        </w:rPr>
+        <w:t xml:space="preserve">Receber mensagem de erro ao cadastrar </w:t>
+      </w:r>
+      <w:r>
+        <w:rPr>
+          <w:color w:val="000000" w:themeColor="text1"/>
+        </w:rPr>
+        <w:t>perfil</w:t>
+      </w:r>
+      <w:r>
+        <w:rPr>
+          <w:color w:val="000000" w:themeColor="text1"/>
+        </w:rPr>
+        <w:t xml:space="preserve"> inválido.</w:t>
+      </w:r>
+    </w:p>
+    <w:p>
+      <w:pPr>
+        <w:rPr>
+          <w:color w:val="000000" w:themeColor="text1"/>
+        </w:rPr>
+      </w:pPr>
+      <w:r>
+        <w:rPr>
+          <w:b/>
+          <w:color w:val="000000" w:themeColor="text1"/>
+        </w:rPr>
+        <w:t>Dados do teste:</w:t>
+      </w:r>
+      <w:r>
+        <w:rPr>
+          <w:color w:val="000000" w:themeColor="text1"/>
+        </w:rPr>
+        <w:t xml:space="preserve"> </w:t>
+      </w:r>
+    </w:p>
+    <w:p>
+      <w:pPr>
+        <w:ind w:firstLine="720"/>
+        <w:rPr>
+          <w:color w:val="000000" w:themeColor="text1"/>
+        </w:rPr>
+      </w:pPr>
+      <w:r>
+        <w:rPr>
+          <w:color w:val="000000" w:themeColor="text1"/>
+        </w:rPr>
+        <w:t>{</w:t>
+      </w:r>
+    </w:p>
+    <w:p>
+      <w:pPr>
+        <w:rPr>
+          <w:color w:val="000000" w:themeColor="text1"/>
+        </w:rPr>
+      </w:pPr>
+      <w:r>
+        <w:rPr>
+          <w:color w:val="000000" w:themeColor="text1"/>
+        </w:rPr>
+        <w:tab/>
+      </w:r>
+      <w:r>
+        <w:rPr>
+          <w:color w:val="000000" w:themeColor="text1"/>
+        </w:rPr>
+        <w:tab/>
+        <w:t>nome: “Usuário Teste”</w:t>
+      </w:r>
+    </w:p>
+    <w:p>
+      <w:pPr>
+        <w:rPr>
+          <w:color w:val="000000" w:themeColor="text1"/>
+          <w:lang w:val="en-US"/>
+        </w:rPr>
+      </w:pPr>
+      <w:r>
+        <w:rPr>
+          <w:color w:val="000000" w:themeColor="text1"/>
+        </w:rPr>
+        <w:tab/>
+      </w:r>
+      <w:r>
+        <w:rPr>
+          <w:color w:val="000000" w:themeColor="text1"/>
+        </w:rPr>
+        <w:tab/>
+      </w:r>
+      <w:r>
+        <w:rPr>
+          <w:color w:val="000000" w:themeColor="text1"/>
+          <w:lang w:val="en-US"/>
+        </w:rPr>
+        <w:t>login: “login_existente”</w:t>
+      </w:r>
+    </w:p>
+    <w:p>
+      <w:pPr>
+        <w:rPr>
+          <w:color w:val="000000" w:themeColor="text1"/>
+          <w:lang w:val="en-US"/>
+        </w:rPr>
+      </w:pPr>
+      <w:r>
+        <w:rPr>
+          <w:color w:val="000000" w:themeColor="text1"/>
+          <w:lang w:val="en-US"/>
+        </w:rPr>
+        <w:tab/>
+      </w:r>
+      <w:r>
+        <w:rPr>
+          <w:color w:val="000000" w:themeColor="text1"/>
+          <w:lang w:val="en-US"/>
+        </w:rPr>
+        <w:tab/>
+        <w:t>password: “teste”</w:t>
+      </w:r>
+    </w:p>
+    <w:p>
+      <w:pPr>
+        <w:rPr>
+          <w:color w:val="000000" w:themeColor="text1"/>
+        </w:rPr>
+      </w:pPr>
+      <w:r>
+        <w:rPr>
+          <w:color w:val="000000" w:themeColor="text1"/>
+          <w:lang w:val="en-US"/>
+        </w:rPr>
+        <w:tab/>
+      </w:r>
+      <w:r>
+        <w:rPr>
+          <w:color w:val="000000" w:themeColor="text1"/>
+          <w:lang w:val="en-US"/>
+        </w:rPr>
+        <w:tab/>
+      </w:r>
+      <w:r>
+        <w:rPr>
+          <w:color w:val="000000" w:themeColor="text1"/>
+        </w:rPr>
+        <w:t>telefone: “11912345678”</w:t>
+      </w:r>
+    </w:p>
+    <w:p>
+      <w:pPr>
+        <w:rPr>
+          <w:color w:val="000000" w:themeColor="text1"/>
+        </w:rPr>
+      </w:pPr>
+      <w:r>
+        <w:rPr>
+          <w:color w:val="000000" w:themeColor="text1"/>
+        </w:rPr>
+        <w:tab/>
+      </w:r>
+      <w:r>
+        <w:rPr>
+          <w:color w:val="000000" w:themeColor="text1"/>
+        </w:rPr>
+        <w:tab/>
+        <w:t>email: “teste@email.com”</w:t>
+      </w:r>
+    </w:p>
+    <w:p>
+      <w:pPr>
+        <w:rPr>
+          <w:color w:val="000000" w:themeColor="text1"/>
+        </w:rPr>
+      </w:pPr>
+      <w:r>
+        <w:rPr>
+          <w:color w:val="000000" w:themeColor="text1"/>
+        </w:rPr>
+        <w:tab/>
+      </w:r>
+      <w:r>
+        <w:rPr>
+          <w:color w:val="000000" w:themeColor="text1"/>
+        </w:rPr>
+        <w:tab/>
+        <w:t>status: INATIVO</w:t>
+      </w:r>
+    </w:p>
+    <w:p>
+      <w:pPr>
+        <w:rPr>
+          <w:color w:val="000000" w:themeColor="text1"/>
+        </w:rPr>
+      </w:pPr>
+      <w:r>
+        <w:rPr>
+          <w:color w:val="000000" w:themeColor="text1"/>
+        </w:rPr>
+        <w:tab/>
+      </w:r>
+      <w:r>
+        <w:rPr>
+          <w:color w:val="000000" w:themeColor="text1"/>
+        </w:rPr>
+        <w:tab/>
+        <w:t xml:space="preserve">perfil: </w:t>
+      </w:r>
+      <w:r>
+        <w:rPr>
+          <w:color w:val="000000" w:themeColor="text1"/>
+        </w:rPr>
+        <w:t>VISITANTE</w:t>
+      </w:r>
+    </w:p>
+    <w:p>
+      <w:pPr>
+        <w:rPr>
+          <w:color w:val="000000" w:themeColor="text1"/>
+        </w:rPr>
+      </w:pPr>
+      <w:r>
+        <w:rPr>
+          <w:color w:val="000000" w:themeColor="text1"/>
+        </w:rPr>
+        <w:tab/>
+        <w:t>}</w:t>
+      </w:r>
+    </w:p>
+    <w:p>
+      <w:pPr>
+        <w:tabs>
+          <w:tab w:val="right" w:pos="9640"/>
+        </w:tabs>
+        <w:rPr>
+          <w:color w:val="000000" w:themeColor="text1"/>
+        </w:rPr>
+      </w:pPr>
+      <w:r>
+        <w:rPr>
+          <w:b/>
+          <w:color w:val="000000" w:themeColor="text1"/>
+        </w:rPr>
+        <w:t xml:space="preserve">Resultado esperado: </w:t>
+      </w:r>
+      <w:r>
+        <w:rPr>
+          <w:color w:val="000000" w:themeColor="text1"/>
+        </w:rPr>
+        <w:t>Lançar exceção Invalid</w:t>
+      </w:r>
+      <w:r>
+        <w:rPr>
+          <w:color w:val="000000" w:themeColor="text1"/>
+        </w:rPr>
+        <w:t>Perfil</w:t>
+      </w:r>
+      <w:r>
+        <w:rPr>
+          <w:color w:val="000000" w:themeColor="text1"/>
+        </w:rPr>
+        <w:t>Exception com a mensagem “</w:t>
+      </w:r>
+      <w:r>
+        <w:rPr>
+          <w:color w:val="000000" w:themeColor="text1"/>
+        </w:rPr>
+        <w:t>Perfil do usuário inválido</w:t>
+      </w:r>
+      <w:r>
+        <w:rPr>
+          <w:color w:val="000000" w:themeColor="text1"/>
+        </w:rPr>
+        <w:t>”.</w:t>
       </w:r>
       <w:r>
         <w:rPr>
@@ -22074,6 +21438,92 @@
     </w:lvl>
   </w:abstractNum>
   <w:abstractNum w:abstractNumId="21" w15:restartNumberingAfterBreak="0">
+    <w:nsid w:val="101A6001"/>
+    <w:multiLevelType w:val="multilevel"/>
+    <w:tmpl w:val="D6249753"/>
+    <w:lvl w:ilvl="0">
+      <w:start w:val="1"/>
+      <w:numFmt w:val="decimal"/>
+      <w:lvlText w:val="%1."/>
+      <w:lvlJc w:val="left"/>
+      <w:pPr>
+        <w:ind w:left="709" w:hanging="360"/>
+      </w:pPr>
+    </w:lvl>
+    <w:lvl w:ilvl="1">
+      <w:start w:val="1"/>
+      <w:numFmt w:val="lowerLetter"/>
+      <w:lvlText w:val="%2."/>
+      <w:lvlJc w:val="left"/>
+      <w:pPr>
+        <w:ind w:left="1429" w:hanging="360"/>
+      </w:pPr>
+    </w:lvl>
+    <w:lvl w:ilvl="2">
+      <w:start w:val="1"/>
+      <w:numFmt w:val="lowerRoman"/>
+      <w:lvlText w:val="%3."/>
+      <w:lvlJc w:val="right"/>
+      <w:pPr>
+        <w:ind w:left="2149" w:hanging="180"/>
+      </w:pPr>
+    </w:lvl>
+    <w:lvl w:ilvl="3">
+      <w:start w:val="1"/>
+      <w:numFmt w:val="decimal"/>
+      <w:lvlText w:val="%4."/>
+      <w:lvlJc w:val="left"/>
+      <w:pPr>
+        <w:ind w:left="2869" w:hanging="360"/>
+      </w:pPr>
+    </w:lvl>
+    <w:lvl w:ilvl="4">
+      <w:start w:val="1"/>
+      <w:numFmt w:val="lowerLetter"/>
+      <w:lvlText w:val="%5."/>
+      <w:lvlJc w:val="left"/>
+      <w:pPr>
+        <w:ind w:left="3589" w:hanging="360"/>
+      </w:pPr>
+    </w:lvl>
+    <w:lvl w:ilvl="5">
+      <w:start w:val="1"/>
+      <w:numFmt w:val="lowerRoman"/>
+      <w:lvlText w:val="%6."/>
+      <w:lvlJc w:val="right"/>
+      <w:pPr>
+        <w:ind w:left="4309" w:hanging="180"/>
+      </w:pPr>
+    </w:lvl>
+    <w:lvl w:ilvl="6">
+      <w:start w:val="1"/>
+      <w:numFmt w:val="decimal"/>
+      <w:lvlText w:val="%7."/>
+      <w:lvlJc w:val="left"/>
+      <w:pPr>
+        <w:ind w:left="5029" w:hanging="360"/>
+      </w:pPr>
+    </w:lvl>
+    <w:lvl w:ilvl="7">
+      <w:start w:val="1"/>
+      <w:numFmt w:val="lowerLetter"/>
+      <w:lvlText w:val="%8."/>
+      <w:lvlJc w:val="left"/>
+      <w:pPr>
+        <w:ind w:left="5749" w:hanging="360"/>
+      </w:pPr>
+    </w:lvl>
+    <w:lvl w:ilvl="8">
+      <w:start w:val="1"/>
+      <w:numFmt w:val="lowerRoman"/>
+      <w:lvlText w:val="%9."/>
+      <w:lvlJc w:val="right"/>
+      <w:pPr>
+        <w:ind w:left="6469" w:hanging="180"/>
+      </w:pPr>
+    </w:lvl>
+  </w:abstractNum>
+  <w:abstractNum w:abstractNumId="22" w15:restartNumberingAfterBreak="0">
     <w:nsid w:val="150B4F03"/>
     <w:multiLevelType w:val="multilevel"/>
     <w:tmpl w:val="150B4F03"/>
@@ -22186,7 +21636,7 @@
       </w:rPr>
     </w:lvl>
   </w:abstractNum>
-  <w:abstractNum w:abstractNumId="22" w15:restartNumberingAfterBreak="0">
+  <w:abstractNum w:abstractNumId="23" w15:restartNumberingAfterBreak="0">
     <w:nsid w:val="19ADB2C0"/>
     <w:multiLevelType w:val="multilevel"/>
     <w:tmpl w:val="19ADB2C0"/>
@@ -22299,7 +21749,7 @@
       </w:rPr>
     </w:lvl>
   </w:abstractNum>
-  <w:abstractNum w:abstractNumId="23" w15:restartNumberingAfterBreak="0">
+  <w:abstractNum w:abstractNumId="24" w15:restartNumberingAfterBreak="0">
     <w:nsid w:val="1A3FB36C"/>
     <w:multiLevelType w:val="multilevel"/>
     <w:tmpl w:val="1A3FB36C"/>
@@ -22385,7 +21835,7 @@
       </w:pPr>
     </w:lvl>
   </w:abstractNum>
-  <w:abstractNum w:abstractNumId="24" w15:restartNumberingAfterBreak="0">
+  <w:abstractNum w:abstractNumId="25" w15:restartNumberingAfterBreak="0">
     <w:nsid w:val="27008D19"/>
     <w:multiLevelType w:val="multilevel"/>
     <w:tmpl w:val="27008D19"/>
@@ -22498,7 +21948,7 @@
       </w:rPr>
     </w:lvl>
   </w:abstractNum>
-  <w:abstractNum w:abstractNumId="25" w15:restartNumberingAfterBreak="0">
+  <w:abstractNum w:abstractNumId="26" w15:restartNumberingAfterBreak="0">
     <w:nsid w:val="298A559A"/>
     <w:multiLevelType w:val="multilevel"/>
     <w:tmpl w:val="298A559A"/>
@@ -22584,7 +22034,7 @@
       </w:pPr>
     </w:lvl>
   </w:abstractNum>
-  <w:abstractNum w:abstractNumId="26" w15:restartNumberingAfterBreak="0">
+  <w:abstractNum w:abstractNumId="27" w15:restartNumberingAfterBreak="0">
     <w:nsid w:val="2C92822C"/>
     <w:multiLevelType w:val="multilevel"/>
     <w:tmpl w:val="2C92822C"/>
@@ -22670,7 +22120,7 @@
       </w:pPr>
     </w:lvl>
   </w:abstractNum>
-  <w:abstractNum w:abstractNumId="27" w15:restartNumberingAfterBreak="0">
+  <w:abstractNum w:abstractNumId="28" w15:restartNumberingAfterBreak="0">
     <w:nsid w:val="3FE4C89D"/>
     <w:multiLevelType w:val="multilevel"/>
     <w:tmpl w:val="3FE4C89D"/>
@@ -22783,7 +22233,7 @@
       </w:rPr>
     </w:lvl>
   </w:abstractNum>
-  <w:abstractNum w:abstractNumId="28" w15:restartNumberingAfterBreak="0">
+  <w:abstractNum w:abstractNumId="29" w15:restartNumberingAfterBreak="0">
     <w:nsid w:val="5B1F2113"/>
     <w:multiLevelType w:val="multilevel"/>
     <w:tmpl w:val="5B1F2113"/>
@@ -22869,7 +22319,7 @@
       </w:pPr>
     </w:lvl>
   </w:abstractNum>
-  <w:abstractNum w:abstractNumId="29" w15:restartNumberingAfterBreak="0">
+  <w:abstractNum w:abstractNumId="30" w15:restartNumberingAfterBreak="0">
     <w:nsid w:val="5C86D1E7"/>
     <w:multiLevelType w:val="multilevel"/>
     <w:tmpl w:val="5C86D1E7"/>
@@ -22955,7 +22405,7 @@
       </w:pPr>
     </w:lvl>
   </w:abstractNum>
-  <w:abstractNum w:abstractNumId="30" w15:restartNumberingAfterBreak="0">
+  <w:abstractNum w:abstractNumId="31" w15:restartNumberingAfterBreak="0">
     <w:nsid w:val="640F107F"/>
     <w:multiLevelType w:val="multilevel"/>
     <w:tmpl w:val="640F107F"/>
@@ -23068,7 +22518,7 @@
       </w:rPr>
     </w:lvl>
   </w:abstractNum>
-  <w:abstractNum w:abstractNumId="31" w15:restartNumberingAfterBreak="0">
+  <w:abstractNum w:abstractNumId="32" w15:restartNumberingAfterBreak="0">
     <w:nsid w:val="66237748"/>
     <w:multiLevelType w:val="multilevel"/>
     <w:tmpl w:val="66237748"/>
@@ -23154,7 +22604,7 @@
       </w:pPr>
     </w:lvl>
   </w:abstractNum>
-  <w:abstractNum w:abstractNumId="32" w15:restartNumberingAfterBreak="0">
+  <w:abstractNum w:abstractNumId="33" w15:restartNumberingAfterBreak="0">
     <w:nsid w:val="6E279532"/>
     <w:multiLevelType w:val="multilevel"/>
     <w:tmpl w:val="6E279532"/>
@@ -23240,7 +22690,7 @@
       </w:pPr>
     </w:lvl>
   </w:abstractNum>
-  <w:abstractNum w:abstractNumId="33" w15:restartNumberingAfterBreak="0">
+  <w:abstractNum w:abstractNumId="34" w15:restartNumberingAfterBreak="0">
     <w:nsid w:val="7984BBB5"/>
     <w:multiLevelType w:val="multilevel"/>
     <w:tmpl w:val="7984BBB5"/>
@@ -23357,13 +22807,13 @@
     <w:abstractNumId w:val="9"/>
   </w:num>
   <w:num w:numId="2" w16cid:durableId="1418667790">
-    <w:abstractNumId w:val="33"/>
+    <w:abstractNumId w:val="34"/>
   </w:num>
   <w:num w:numId="3" w16cid:durableId="2040272451">
-    <w:abstractNumId w:val="21"/>
+    <w:abstractNumId w:val="22"/>
   </w:num>
   <w:num w:numId="4" w16cid:durableId="245379920">
-    <w:abstractNumId w:val="27"/>
+    <w:abstractNumId w:val="28"/>
   </w:num>
   <w:num w:numId="5" w16cid:durableId="1226647556">
     <w:abstractNumId w:val="5"/>
@@ -23384,7 +22834,7 @@
     <w:abstractNumId w:val="6"/>
   </w:num>
   <w:num w:numId="11" w16cid:durableId="738289895">
-    <w:abstractNumId w:val="24"/>
+    <w:abstractNumId w:val="25"/>
   </w:num>
   <w:num w:numId="12" w16cid:durableId="876889145">
     <w:abstractNumId w:val="4"/>
@@ -23393,22 +22843,22 @@
     <w:abstractNumId w:val="11"/>
   </w:num>
   <w:num w:numId="14" w16cid:durableId="583954812">
-    <w:abstractNumId w:val="22"/>
+    <w:abstractNumId w:val="23"/>
   </w:num>
   <w:num w:numId="15" w16cid:durableId="1023286004">
-    <w:abstractNumId w:val="30"/>
+    <w:abstractNumId w:val="31"/>
   </w:num>
   <w:num w:numId="16" w16cid:durableId="641495988">
-    <w:abstractNumId w:val="26"/>
+    <w:abstractNumId w:val="27"/>
   </w:num>
   <w:num w:numId="17" w16cid:durableId="2139376182">
     <w:abstractNumId w:val="16"/>
   </w:num>
   <w:num w:numId="18" w16cid:durableId="1821190697">
-    <w:abstractNumId w:val="23"/>
+    <w:abstractNumId w:val="24"/>
   </w:num>
   <w:num w:numId="19" w16cid:durableId="837303888">
-    <w:abstractNumId w:val="31"/>
+    <w:abstractNumId w:val="32"/>
   </w:num>
   <w:num w:numId="20" w16cid:durableId="351763522">
     <w:abstractNumId w:val="19"/>
@@ -23423,7 +22873,7 @@
     <w:abstractNumId w:val="2"/>
   </w:num>
   <w:num w:numId="24" w16cid:durableId="959531377">
-    <w:abstractNumId w:val="25"/>
+    <w:abstractNumId w:val="26"/>
   </w:num>
   <w:num w:numId="25" w16cid:durableId="972905196">
     <w:abstractNumId w:val="17"/>
@@ -23432,7 +22882,7 @@
     <w:abstractNumId w:val="3"/>
   </w:num>
   <w:num w:numId="27" w16cid:durableId="1998798153">
-    <w:abstractNumId w:val="32"/>
+    <w:abstractNumId w:val="33"/>
   </w:num>
   <w:num w:numId="28" w16cid:durableId="105345891">
     <w:abstractNumId w:val="12"/>
@@ -23441,7 +22891,7 @@
     <w:abstractNumId w:val="18"/>
   </w:num>
   <w:num w:numId="30" w16cid:durableId="1568951784">
-    <w:abstractNumId w:val="28"/>
+    <w:abstractNumId w:val="29"/>
   </w:num>
   <w:num w:numId="31" w16cid:durableId="1544243654">
     <w:abstractNumId w:val="20"/>
@@ -23450,10 +22900,13 @@
     <w:abstractNumId w:val="15"/>
   </w:num>
   <w:num w:numId="33" w16cid:durableId="98643128">
-    <w:abstractNumId w:val="29"/>
+    <w:abstractNumId w:val="30"/>
   </w:num>
   <w:num w:numId="34" w16cid:durableId="265161166">
     <w:abstractNumId w:val="13"/>
+  </w:num>
+  <w:num w:numId="35" w16cid:durableId="1250846852">
+    <w:abstractNumId w:val="21"/>
   </w:num>
 </w:numbering>
 </file>
@@ -35381,6 +34834,10 @@
 </file>
 
 <file path=customXml/item1.xml><?xml version="1.0" encoding="utf-8"?>
+<b:Sources xmlns:b="http://schemas.openxmlformats.org/officeDocument/2006/bibliography" xmlns="http://schemas.openxmlformats.org/officeDocument/2006/bibliography" SelectedStyle="\APASixthEditionOfficeOnline.xsl" StyleName="APA" Version="6"/>
+</file>
+
+<file path=customXml/item2.xml><?xml version="1.0" encoding="utf-8"?>
 <s:customData xmlns="http://www.wps.cn/officeDocument/2013/wpsCustomData" xmlns:s="http://www.wps.cn/officeDocument/2013/wpsCustomData">
   <customSectProps>
     <customSectPr/>
@@ -35391,22 +34848,18 @@
 </s:customData>
 </file>
 
-<file path=customXml/item2.xml><?xml version="1.0" encoding="utf-8"?>
-<b:Sources xmlns:b="http://schemas.openxmlformats.org/officeDocument/2006/bibliography" xmlns="http://schemas.openxmlformats.org/officeDocument/2006/bibliography" SelectedStyle="\APASixthEditionOfficeOnline.xsl" StyleName="APA" Version="6"/>
+<file path=customXml/itemProps1.xml><?xml version="1.0" encoding="utf-8"?>
+<ds:datastoreItem xmlns:ds="http://schemas.openxmlformats.org/officeDocument/2006/customXml" ds:itemID="{75400C70-4AD9-4CF0-BDD7-04B6E78E53B3}">
+  <ds:schemaRefs>
+    <ds:schemaRef ds:uri="http://schemas.openxmlformats.org/officeDocument/2006/bibliography"/>
+  </ds:schemaRefs>
+</ds:datastoreItem>
 </file>
 
-<file path=customXml/itemProps1.xml><?xml version="1.0" encoding="utf-8"?>
+<file path=customXml/itemProps2.xml><?xml version="1.0" encoding="utf-8"?>
 <ds:datastoreItem xmlns:ds="http://schemas.openxmlformats.org/officeDocument/2006/customXml" ds:itemID="{B1977F7D-205B-4081-913C-38D41E755F92}">
   <ds:schemaRefs>
     <ds:schemaRef ds:uri="http://www.wps.cn/officeDocument/2013/wpsCustomData"/>
   </ds:schemaRefs>
 </ds:datastoreItem>
-</file>
-
-<file path=customXml/itemProps2.xml><?xml version="1.0" encoding="utf-8"?>
-<ds:datastoreItem xmlns:ds="http://schemas.openxmlformats.org/officeDocument/2006/customXml" ds:itemID="{75400C70-4AD9-4CF0-BDD7-04B6E78E53B3}">
-  <ds:schemaRefs>
-    <ds:schemaRef ds:uri="http://schemas.openxmlformats.org/officeDocument/2006/bibliography"/>
-  </ds:schemaRefs>
-</ds:datastoreItem>
 </file>
</xml_diff>